<commit_message>
Klasse 9: generierte Ausgabe-Dateien aus PR entfernen
</commit_message>
<xml_diff>
--- a/Ausgabe/Klasse_9/01_Informationen_und_Daten/01_Arbeitsheft.docx
+++ b/Ausgabe/Klasse_9/01_Informationen_und_Daten/01_Arbeitsheft.docx
@@ -4645,7 +4645,7 @@
     </w:p>
     <w:bookmarkEnd w:id="66"/>
     <w:bookmarkEnd w:id="67"/>
-    <w:bookmarkStart w:id="74" w:name="ordnung-schaffen"/>
+    <w:bookmarkStart w:id="68" w:name="ordnung-schaffen"/>
     <w:p>
       <w:pPr>
         <w:pStyle w:val="Heading1"/>
@@ -4655,320 +4655,12 @@
       </w:r>
     </w:p>
     <w:p>
-      <w:pPr>
-        <w:pStyle w:val="FirstParagraph"/>
-      </w:pPr>
-      <w:r>
-        <w:t xml:space="preserve">Informationen werden erst dann gut nutzbar, wenn sie nach nachvollziehbaren Regeln geordnet sind. In dieser Stunde untersuchst du verschiedene Ordnungsmöglichkeiten und ihre Grenzen.</w:t>
-      </w:r>
-    </w:p>
-    <w:bookmarkStart w:id="68" w:name="gleiche-daten-unterschiedliche-ordnung"/>
-    <w:p>
-      <w:pPr>
-        <w:pStyle w:val="Heading2"/>
-      </w:pPr>
-      <w:r>
-        <w:t xml:space="preserve">1. Gleiche Daten – unterschiedliche Ordnung</w:t>
-      </w:r>
-    </w:p>
-    <w:p>
-      <w:pPr>
-        <w:pStyle w:val="FirstParagraph"/>
-      </w:pPr>
-      <w:r>
-        <w:t xml:space="preserve">Gegeben sind Medien einer Schulbibliothek mit den Merkmalen</w:t>
-      </w:r>
-      <w:r>
-        <w:t xml:space="preserve"> </w:t>
-      </w:r>
-      <w:r>
-        <w:rPr>
-          <w:bCs/>
-          <w:b/>
-        </w:rPr>
-        <w:t xml:space="preserve">Titel</w:t>
-      </w:r>
-      <w:r>
-        <w:t xml:space="preserve">,</w:t>
-      </w:r>
-      <w:r>
-        <w:t xml:space="preserve"> </w:t>
-      </w:r>
-      <w:r>
-        <w:rPr>
-          <w:bCs/>
-          <w:b/>
-        </w:rPr>
-        <w:t xml:space="preserve">Autor/in</w:t>
-      </w:r>
-      <w:r>
-        <w:t xml:space="preserve">,</w:t>
-      </w:r>
-      <w:r>
-        <w:t xml:space="preserve"> </w:t>
-      </w:r>
-      <w:r>
-        <w:rPr>
-          <w:bCs/>
-          <w:b/>
-        </w:rPr>
-        <w:t xml:space="preserve">Erscheinungsjahr</w:t>
-      </w:r>
-      <w:r>
-        <w:t xml:space="preserve"> </w:t>
-      </w:r>
-      <w:r>
-        <w:t xml:space="preserve">und</w:t>
-      </w:r>
-      <w:r>
-        <w:t xml:space="preserve"> </w:t>
-      </w:r>
-      <w:r>
-        <w:rPr>
-          <w:bCs/>
-          <w:b/>
-        </w:rPr>
-        <w:t xml:space="preserve">Thema</w:t>
-      </w:r>
-      <w:r>
-        <w:t xml:space="preserve">.</w:t>
-      </w:r>
-    </w:p>
-    <w:p>
-      <w:pPr>
-        <w:pStyle w:val="BodyText"/>
-      </w:pPr>
-      <w:r>
-        <w:t xml:space="preserve">Ordne dieselben fünf Beispieldatensätze nacheinander nach:</w:t>
-      </w:r>
-      <w:r>
-        <w:t xml:space="preserve"> </w:t>
-      </w:r>
-      <w:r>
-        <w:t xml:space="preserve">1. Titel,</w:t>
-      </w:r>
-      <w:r>
-        <w:t xml:space="preserve"> </w:t>
-      </w:r>
-      <w:r>
-        <w:t xml:space="preserve">2. Autor/in,</w:t>
-      </w:r>
-      <w:r>
-        <w:t xml:space="preserve"> </w:t>
-      </w:r>
-      <w:r>
-        <w:t xml:space="preserve">3. Erscheinungsjahr,</w:t>
-      </w:r>
-      <w:r>
-        <w:t xml:space="preserve"> </w:t>
-      </w:r>
-      <w:r>
-        <w:t xml:space="preserve">4. Thema.</w:t>
-      </w:r>
-    </w:p>
-    <w:p>
-      <w:pPr>
-        <w:pStyle w:val="BodyText"/>
-      </w:pPr>
-      <w:r>
-        <w:t xml:space="preserve">Notiere jeweils: Für welche Suchfrage ist diese Ordnung besonders hilfreich?</w:t>
+      <w:r>
+        <w:br w:type="page"/>
       </w:r>
     </w:p>
     <w:bookmarkEnd w:id="68"/>
-    <w:bookmarkStart w:id="69" w:name="ein-merkmal-reicht-nicht-immer"/>
-    <w:p>
-      <w:pPr>
-        <w:pStyle w:val="Heading2"/>
-      </w:pPr>
-      <w:r>
-        <w:t xml:space="preserve">2. Ein Merkmal reicht nicht immer</w:t>
-      </w:r>
-    </w:p>
-    <w:p>
-      <w:pPr>
-        <w:pStyle w:val="FirstParagraph"/>
-      </w:pPr>
-      <w:r>
-        <w:t xml:space="preserve">Zwei Bücher haben denselben Autor. Wie kannst du trotzdem eine eindeutige Reihenfolge herstellen? Formuliere eine Sortierregel mit einem zweiten Merkmal.</w:t>
-      </w:r>
-    </w:p>
-    <w:bookmarkEnd w:id="69"/>
-    <w:bookmarkStart w:id="70" w:name="sortieren-oder-gruppieren"/>
-    <w:p>
-      <w:pPr>
-        <w:pStyle w:val="Heading2"/>
-      </w:pPr>
-      <w:r>
-        <w:t xml:space="preserve">3. Sortieren oder Gruppieren?</w:t>
-      </w:r>
-    </w:p>
-    <w:p>
-      <w:pPr>
-        <w:pStyle w:val="FirstParagraph"/>
-      </w:pPr>
-      <w:r>
-        <w:t xml:space="preserve">Entscheide und begründe:</w:t>
-      </w:r>
-      <w:r>
-        <w:t xml:space="preserve"> </w:t>
-      </w:r>
-      <w:r>
-        <w:t xml:space="preserve">- Bücher alphabetisch nach Titel anordnen,</w:t>
-      </w:r>
-      <w:r>
-        <w:t xml:space="preserve"> </w:t>
-      </w:r>
-      <w:r>
-        <w:t xml:space="preserve">- Bücher nach Themenbereichen zusammenfassen,</w:t>
-      </w:r>
-      <w:r>
-        <w:t xml:space="preserve"> </w:t>
-      </w:r>
-      <w:r>
-        <w:t xml:space="preserve">- Messwerte vom kleinsten zum größten Wert anordnen,</w:t>
-      </w:r>
-      <w:r>
-        <w:t xml:space="preserve"> </w:t>
-      </w:r>
-      <w:r>
-        <w:t xml:space="preserve">- Fotos nach Aufnahmeort zusammenfassen.</w:t>
-      </w:r>
-    </w:p>
-    <w:p>
-      <w:pPr>
-        <w:pStyle w:val="BodyText"/>
-      </w:pPr>
-      <w:r>
-        <w:rPr>
-          <w:bCs/>
-          <w:b/>
-        </w:rPr>
-        <w:t xml:space="preserve">Merke:</w:t>
-      </w:r>
-      <w:r>
-        <w:t xml:space="preserve"> </w:t>
-      </w:r>
-      <w:r>
-        <w:t xml:space="preserve">Sortieren erzeugt eine Reihenfolge. Gruppieren fasst Datensätze nach gemeinsamen Merkmalen zusammen.</w:t>
-      </w:r>
-    </w:p>
-    <w:bookmarkEnd w:id="70"/>
-    <w:bookmarkStart w:id="71" w:name="gute-ordnungskriterien"/>
-    <w:p>
-      <w:pPr>
-        <w:pStyle w:val="Heading2"/>
-      </w:pPr>
-      <w:r>
-        <w:t xml:space="preserve">4. Gute Ordnungskriterien</w:t>
-      </w:r>
-    </w:p>
-    <w:p>
-      <w:pPr>
-        <w:pStyle w:val="FirstParagraph"/>
-      </w:pPr>
-      <w:r>
-        <w:t xml:space="preserve">Bewerte die Kriterien</w:t>
-      </w:r>
-      <w:r>
-        <w:t xml:space="preserve"> </w:t>
-      </w:r>
-      <w:r>
-        <w:rPr>
-          <w:bCs/>
-          <w:b/>
-        </w:rPr>
-        <w:t xml:space="preserve">verständlich</w:t>
-      </w:r>
-      <w:r>
-        <w:t xml:space="preserve">,</w:t>
-      </w:r>
-      <w:r>
-        <w:t xml:space="preserve"> </w:t>
-      </w:r>
-      <w:r>
-        <w:rPr>
-          <w:bCs/>
-          <w:b/>
-        </w:rPr>
-        <w:t xml:space="preserve">eindeutig</w:t>
-      </w:r>
-      <w:r>
-        <w:t xml:space="preserve">,</w:t>
-      </w:r>
-      <w:r>
-        <w:t xml:space="preserve"> </w:t>
-      </w:r>
-      <w:r>
-        <w:rPr>
-          <w:bCs/>
-          <w:b/>
-        </w:rPr>
-        <w:t xml:space="preserve">für den Zweck geeignet</w:t>
-      </w:r>
-      <w:r>
-        <w:t xml:space="preserve"> </w:t>
-      </w:r>
-      <w:r>
-        <w:t xml:space="preserve">und</w:t>
-      </w:r>
-      <w:r>
-        <w:t xml:space="preserve"> </w:t>
-      </w:r>
-      <w:r>
-        <w:rPr>
-          <w:bCs/>
-          <w:b/>
-        </w:rPr>
-        <w:t xml:space="preserve">auf alle Datensätze anwendbar</w:t>
-      </w:r>
-      <w:r>
-        <w:t xml:space="preserve">. Erkläre an einem Gegenbeispiel, was passiert, wenn ein Kriterium unklar ist.</w:t>
-      </w:r>
-    </w:p>
-    <w:bookmarkEnd w:id="71"/>
-    <w:bookmarkStart w:id="72" w:name="transfer"/>
-    <w:p>
-      <w:pPr>
-        <w:pStyle w:val="Heading2"/>
-      </w:pPr>
-      <w:r>
-        <w:t xml:space="preserve">5. Transfer</w:t>
-      </w:r>
-    </w:p>
-    <w:p>
-      <w:pPr>
-        <w:pStyle w:val="FirstParagraph"/>
-      </w:pPr>
-      <w:r>
-        <w:t xml:space="preserve">Eine Klasse sammelt Ergebnisse einer Umfrage zu Verkehrsmitteln auf dem Schulweg. Entwickle zwei unterschiedliche sinnvolle Ordnungen der Daten und erkläre, welche Fragestellung damit jeweils leichter beantwortet werden kann.</w:t>
-      </w:r>
-    </w:p>
-    <w:bookmarkEnd w:id="72"/>
-    <w:bookmarkStart w:id="73" w:name="reflexion"/>
-    <w:p>
-      <w:pPr>
-        <w:pStyle w:val="Heading2"/>
-      </w:pPr>
-      <w:r>
-        <w:t xml:space="preserve">Reflexion</w:t>
-      </w:r>
-    </w:p>
-    <w:p>
-      <w:pPr>
-        <w:pStyle w:val="FirstParagraph"/>
-      </w:pPr>
-      <w:r>
-        <w:t xml:space="preserve">Warum gibt es für eine Datensammlung nicht immer genau eine „richtige“ Ordnung?</w:t>
-      </w:r>
-    </w:p>
-    <w:p>
-      <w:r>
-        <w:br w:type="page"/>
-      </w:r>
-    </w:p>
-    <w:bookmarkEnd w:id="73"/>
-    <w:bookmarkEnd w:id="74"/>
-    <w:bookmarkStart w:id="83" w:name="kapitel-2-eine-gute-ordnung-finden"/>
+    <w:bookmarkStart w:id="77" w:name="kapitel-2-eine-gute-ordnung-finden"/>
     <w:p>
       <w:pPr>
         <w:pStyle w:val="Heading1"/>
@@ -4977,7 +4669,7 @@
         <w:t xml:space="preserve">Kapitel 2 – Eine gute Ordnung finden</w:t>
       </w:r>
     </w:p>
-    <w:bookmarkStart w:id="75" w:name="einstieg-4"/>
+    <w:bookmarkStart w:id="69" w:name="einstieg-4"/>
     <w:p>
       <w:pPr>
         <w:pStyle w:val="Heading2"/>
@@ -5065,8 +4757,8 @@
         </w:pict>
       </w:r>
     </w:p>
-    <w:bookmarkEnd w:id="75"/>
-    <w:bookmarkStart w:id="76" w:name="aufgabe-1-findest-du-die-antwort"/>
+    <w:bookmarkEnd w:id="69"/>
+    <w:bookmarkStart w:id="70" w:name="aufgabe-1-findest-du-die-antwort"/>
     <w:p>
       <w:pPr>
         <w:pStyle w:val="Heading2"/>
@@ -5272,8 +4964,8 @@
         </w:pict>
       </w:r>
     </w:p>
-    <w:bookmarkEnd w:id="76"/>
-    <w:bookmarkStart w:id="77" w:name="aufgabe-2-was-könnte-besser-werden"/>
+    <w:bookmarkEnd w:id="70"/>
+    <w:bookmarkStart w:id="71" w:name="aufgabe-2-was-könnte-besser-werden"/>
     <w:p>
       <w:pPr>
         <w:pStyle w:val="Heading2"/>
@@ -5334,8 +5026,8 @@
         </w:pict>
       </w:r>
     </w:p>
-    <w:bookmarkEnd w:id="77"/>
-    <w:bookmarkStart w:id="78" w:name="Xa636490a3f6a7b83dd9c7303e2ad4867a1a0ea3"/>
+    <w:bookmarkEnd w:id="71"/>
+    <w:bookmarkStart w:id="72" w:name="Xa636490a3f6a7b83dd9c7303e2ad4867a1a0ea3"/>
     <w:p>
       <w:pPr>
         <w:pStyle w:val="Heading2"/>
@@ -5430,8 +5122,8 @@
         </w:pict>
       </w:r>
     </w:p>
-    <w:bookmarkEnd w:id="78"/>
-    <w:bookmarkStart w:id="79" w:name="aufgabe-4-vergleicht-eure-lösungen"/>
+    <w:bookmarkEnd w:id="72"/>
+    <w:bookmarkStart w:id="73" w:name="aufgabe-4-vergleicht-eure-lösungen"/>
     <w:p>
       <w:pPr>
         <w:pStyle w:val="Heading2"/>
@@ -5499,8 +5191,8 @@
         </w:pict>
       </w:r>
     </w:p>
-    <w:bookmarkEnd w:id="79"/>
-    <w:bookmarkStart w:id="80" w:name="denkt-weiter"/>
+    <w:bookmarkEnd w:id="73"/>
+    <w:bookmarkStart w:id="74" w:name="denkt-weiter"/>
     <w:p>
       <w:pPr>
         <w:pStyle w:val="Heading2"/>
@@ -5657,8 +5349,8 @@
         </w:pict>
       </w:r>
     </w:p>
-    <w:bookmarkEnd w:id="80"/>
-    <w:bookmarkStart w:id="81" w:name="merksatz-4"/>
+    <w:bookmarkEnd w:id="74"/>
+    <w:bookmarkStart w:id="75" w:name="merksatz-4"/>
     <w:p>
       <w:pPr>
         <w:pStyle w:val="Heading2"/>
@@ -5718,8 +5410,8 @@
         </w:pict>
       </w:r>
     </w:p>
-    <w:bookmarkEnd w:id="81"/>
-    <w:bookmarkStart w:id="82" w:name="das-nehmen-wir-mit-5"/>
+    <w:bookmarkEnd w:id="75"/>
+    <w:bookmarkStart w:id="76" w:name="das-nehmen-wir-mit-5"/>
     <w:p>
       <w:pPr>
         <w:pStyle w:val="Heading2"/>
@@ -5749,9 +5441,9 @@
         <w:br w:type="page"/>
       </w:r>
     </w:p>
-    <w:bookmarkEnd w:id="82"/>
-    <w:bookmarkEnd w:id="83"/>
-    <w:bookmarkStart w:id="92" w:name="kapitel-2-welche-band-laden-wir-ein"/>
+    <w:bookmarkEnd w:id="76"/>
+    <w:bookmarkEnd w:id="77"/>
+    <w:bookmarkStart w:id="86" w:name="kapitel-2-welche-band-laden-wir-ein"/>
     <w:p>
       <w:pPr>
         <w:pStyle w:val="Heading1"/>
@@ -5760,7 +5452,7 @@
         <w:t xml:space="preserve">Kapitel 2 – Welche Band laden wir ein?</w:t>
       </w:r>
     </w:p>
-    <w:bookmarkStart w:id="84" w:name="einstieg-5"/>
+    <w:bookmarkStart w:id="78" w:name="einstieg-5"/>
     <w:p>
       <w:pPr>
         <w:pStyle w:val="Heading2"/>
@@ -6082,8 +5774,8 @@
         </w:pict>
       </w:r>
     </w:p>
-    <w:bookmarkEnd w:id="84"/>
-    <w:bookmarkStart w:id="85" w:name="aufgabe-1-deine-entscheidung"/>
+    <w:bookmarkEnd w:id="78"/>
+    <w:bookmarkStart w:id="79" w:name="aufgabe-1-deine-entscheidung"/>
     <w:p>
       <w:pPr>
         <w:pStyle w:val="Heading2"/>
@@ -6136,8 +5828,8 @@
         </w:pict>
       </w:r>
     </w:p>
-    <w:bookmarkEnd w:id="85"/>
-    <w:bookmarkStart w:id="86" w:name="X6f33b60f22c1fb294b3095d19d36735edfce0b0"/>
+    <w:bookmarkEnd w:id="79"/>
+    <w:bookmarkStart w:id="80" w:name="X6f33b60f22c1fb294b3095d19d36735edfce0b0"/>
     <w:p>
       <w:pPr>
         <w:pStyle w:val="Heading2"/>
@@ -6215,8 +5907,8 @@
         </w:pict>
       </w:r>
     </w:p>
-    <w:bookmarkEnd w:id="86"/>
-    <w:bookmarkStart w:id="87" w:name="X11030168ddbd4277b0fdf868e8c8f172129906b"/>
+    <w:bookmarkEnd w:id="80"/>
+    <w:bookmarkStart w:id="81" w:name="X11030168ddbd4277b0fdf868e8c8f172129906b"/>
     <w:p>
       <w:pPr>
         <w:pStyle w:val="Heading2"/>
@@ -6306,8 +5998,8 @@
         </w:pict>
       </w:r>
     </w:p>
-    <w:bookmarkEnd w:id="87"/>
-    <w:bookmarkStart w:id="88" w:name="aufgabe-4-neue-situation"/>
+    <w:bookmarkEnd w:id="81"/>
+    <w:bookmarkStart w:id="82" w:name="aufgabe-4-neue-situation"/>
     <w:p>
       <w:pPr>
         <w:pStyle w:val="Heading2"/>
@@ -6392,8 +6084,8 @@
         </w:pict>
       </w:r>
     </w:p>
-    <w:bookmarkEnd w:id="88"/>
-    <w:bookmarkStart w:id="89" w:name="aufgabe-5-noch-eine-änderung"/>
+    <w:bookmarkEnd w:id="82"/>
+    <w:bookmarkStart w:id="83" w:name="aufgabe-5-noch-eine-änderung"/>
     <w:p>
       <w:pPr>
         <w:pStyle w:val="Heading2"/>
@@ -6475,8 +6167,8 @@
         </w:pict>
       </w:r>
     </w:p>
-    <w:bookmarkEnd w:id="89"/>
-    <w:bookmarkStart w:id="90" w:name="merkkasten-1"/>
+    <w:bookmarkEnd w:id="83"/>
+    <w:bookmarkStart w:id="84" w:name="merkkasten-1"/>
     <w:p>
       <w:pPr>
         <w:pStyle w:val="Heading2"/>
@@ -6529,8 +6221,8 @@
         </w:pict>
       </w:r>
     </w:p>
-    <w:bookmarkEnd w:id="90"/>
-    <w:bookmarkStart w:id="91" w:name="das-nehmen-wir-mit-6"/>
+    <w:bookmarkEnd w:id="84"/>
+    <w:bookmarkStart w:id="85" w:name="das-nehmen-wir-mit-6"/>
     <w:p>
       <w:pPr>
         <w:pStyle w:val="Heading2"/>
@@ -6568,9 +6260,9 @@
         <w:br w:type="page"/>
       </w:r>
     </w:p>
-    <w:bookmarkEnd w:id="91"/>
-    <w:bookmarkEnd w:id="92"/>
-    <w:bookmarkStart w:id="100" w:name="kapitel-2-entscheidungen-vergleichen"/>
+    <w:bookmarkEnd w:id="85"/>
+    <w:bookmarkEnd w:id="86"/>
+    <w:bookmarkStart w:id="94" w:name="kapitel-2-entscheidungen-vergleichen"/>
     <w:p>
       <w:pPr>
         <w:pStyle w:val="Heading1"/>
@@ -6579,7 +6271,7 @@
         <w:t xml:space="preserve">Kapitel 2 – Entscheidungen vergleichen</w:t>
       </w:r>
     </w:p>
-    <w:bookmarkStart w:id="93" w:name="einstieg-6"/>
+    <w:bookmarkStart w:id="87" w:name="einstieg-6"/>
     <w:p>
       <w:pPr>
         <w:pStyle w:val="Heading2"/>
@@ -6898,8 +6590,8 @@
         </w:pict>
       </w:r>
     </w:p>
-    <w:bookmarkEnd w:id="93"/>
-    <w:bookmarkStart w:id="94" w:name="aufgabe-1-informationen-auf-einen-blick"/>
+    <w:bookmarkEnd w:id="87"/>
+    <w:bookmarkStart w:id="88" w:name="aufgabe-1-informationen-auf-einen-blick"/>
     <w:p>
       <w:pPr>
         <w:pStyle w:val="Heading2"/>
@@ -7010,8 +6702,8 @@
         </w:pict>
       </w:r>
     </w:p>
-    <w:bookmarkEnd w:id="94"/>
-    <w:bookmarkStart w:id="95" w:name="X41f135c7e35fe92a4f33cc1ca3ddfb423de763d"/>
+    <w:bookmarkEnd w:id="88"/>
+    <w:bookmarkStart w:id="89" w:name="X41f135c7e35fe92a4f33cc1ca3ddfb423de763d"/>
     <w:p>
       <w:pPr>
         <w:pStyle w:val="Heading2"/>
@@ -7088,8 +6780,8 @@
         </w:pict>
       </w:r>
     </w:p>
-    <w:bookmarkEnd w:id="95"/>
-    <w:bookmarkStart w:id="96" w:name="aufgabe-3-eigene-kriterien"/>
+    <w:bookmarkEnd w:id="89"/>
+    <w:bookmarkStart w:id="90" w:name="aufgabe-3-eigene-kriterien"/>
     <w:p>
       <w:pPr>
         <w:pStyle w:val="Heading2"/>
@@ -7290,8 +6982,8 @@
         </w:pict>
       </w:r>
     </w:p>
-    <w:bookmarkEnd w:id="96"/>
-    <w:bookmarkStart w:id="97" w:name="aufgabe-4-grenzen-erkennen"/>
+    <w:bookmarkEnd w:id="90"/>
+    <w:bookmarkStart w:id="91" w:name="aufgabe-4-grenzen-erkennen"/>
     <w:p>
       <w:pPr>
         <w:pStyle w:val="Heading2"/>
@@ -7393,8 +7085,8 @@
         </w:pict>
       </w:r>
     </w:p>
-    <w:bookmarkEnd w:id="97"/>
-    <w:bookmarkStart w:id="98" w:name="merkkasten-2"/>
+    <w:bookmarkEnd w:id="91"/>
+    <w:bookmarkStart w:id="92" w:name="merkkasten-2"/>
     <w:p>
       <w:pPr>
         <w:pStyle w:val="Heading2"/>
@@ -7426,8 +7118,8 @@
         </w:pict>
       </w:r>
     </w:p>
-    <w:bookmarkEnd w:id="98"/>
-    <w:bookmarkStart w:id="99" w:name="das-nehmen-wir-mit-7"/>
+    <w:bookmarkEnd w:id="92"/>
+    <w:bookmarkStart w:id="93" w:name="das-nehmen-wir-mit-7"/>
     <w:p>
       <w:pPr>
         <w:pStyle w:val="Heading2"/>
@@ -7457,9 +7149,9 @@
         <w:br w:type="page"/>
       </w:r>
     </w:p>
-    <w:bookmarkEnd w:id="99"/>
-    <w:bookmarkEnd w:id="100"/>
-    <w:bookmarkStart w:id="101" w:name="wenn-die-informationen-immer-mehr-werden"/>
+    <w:bookmarkEnd w:id="93"/>
+    <w:bookmarkEnd w:id="94"/>
+    <w:bookmarkStart w:id="95" w:name="wenn-die-informationen-immer-mehr-werden"/>
     <w:p>
       <w:pPr>
         <w:pStyle w:val="Heading1"/>
@@ -7473,8 +7165,8 @@
         <w:br w:type="page"/>
       </w:r>
     </w:p>
-    <w:bookmarkEnd w:id="101"/>
-    <w:bookmarkStart w:id="109" w:name="kapitel-3-was-ist-eine-datenbank"/>
+    <w:bookmarkEnd w:id="95"/>
+    <w:bookmarkStart w:id="103" w:name="kapitel-3-was-ist-eine-datenbank"/>
     <w:p>
       <w:pPr>
         <w:pStyle w:val="Heading1"/>
@@ -7483,7 +7175,7 @@
         <w:t xml:space="preserve">Kapitel 3 – Was ist eine Datenbank?</w:t>
       </w:r>
     </w:p>
-    <w:bookmarkStart w:id="102" w:name="einstieg-7"/>
+    <w:bookmarkStart w:id="96" w:name="einstieg-7"/>
     <w:p>
       <w:pPr>
         <w:pStyle w:val="Heading2"/>
@@ -7615,8 +7307,8 @@
         </w:pict>
       </w:r>
     </w:p>
-    <w:bookmarkEnd w:id="102"/>
-    <w:bookmarkStart w:id="103" w:name="aufgabe-1-reicht-eine-tabelle"/>
+    <w:bookmarkEnd w:id="96"/>
+    <w:bookmarkStart w:id="97" w:name="aufgabe-1-reicht-eine-tabelle"/>
     <w:p>
       <w:pPr>
         <w:pStyle w:val="Heading2"/>
@@ -7677,8 +7369,8 @@
         </w:pict>
       </w:r>
     </w:p>
-    <w:bookmarkEnd w:id="103"/>
-    <w:bookmarkStart w:id="104" w:name="aufgabe-2-informationen-gehören-zusammen"/>
+    <w:bookmarkEnd w:id="97"/>
+    <w:bookmarkStart w:id="98" w:name="aufgabe-2-informationen-gehören-zusammen"/>
     <w:p>
       <w:pPr>
         <w:pStyle w:val="Heading2"/>
@@ -7903,8 +7595,8 @@
         </w:pict>
       </w:r>
     </w:p>
-    <w:bookmarkEnd w:id="104"/>
-    <w:bookmarkStart w:id="105" w:name="aufgabe-3-beziehungen-erkennen"/>
+    <w:bookmarkEnd w:id="98"/>
+    <w:bookmarkStart w:id="99" w:name="aufgabe-3-beziehungen-erkennen"/>
     <w:p>
       <w:pPr>
         <w:pStyle w:val="Heading2"/>
@@ -7981,8 +7673,8 @@
         </w:pict>
       </w:r>
     </w:p>
-    <w:bookmarkEnd w:id="105"/>
-    <w:bookmarkStart w:id="106" w:name="aufgabe-4-was-sollte-der-computer-können"/>
+    <w:bookmarkEnd w:id="99"/>
+    <w:bookmarkStart w:id="100" w:name="aufgabe-4-was-sollte-der-computer-können"/>
     <w:p>
       <w:pPr>
         <w:pStyle w:val="Heading2"/>
@@ -8078,8 +7770,8 @@
         </w:pict>
       </w:r>
     </w:p>
-    <w:bookmarkEnd w:id="106"/>
-    <w:bookmarkStart w:id="107" w:name="merkkasten-3"/>
+    <w:bookmarkEnd w:id="100"/>
+    <w:bookmarkStart w:id="101" w:name="merkkasten-3"/>
     <w:p>
       <w:pPr>
         <w:pStyle w:val="Heading2"/>
@@ -8175,8 +7867,8 @@
         </w:pict>
       </w:r>
     </w:p>
-    <w:bookmarkEnd w:id="107"/>
-    <w:bookmarkStart w:id="108" w:name="das-nehmen-wir-mit-8"/>
+    <w:bookmarkEnd w:id="101"/>
+    <w:bookmarkStart w:id="102" w:name="das-nehmen-wir-mit-8"/>
     <w:p>
       <w:pPr>
         <w:pStyle w:val="Heading2"/>
@@ -8214,9 +7906,9 @@
         <w:br w:type="page"/>
       </w:r>
     </w:p>
-    <w:bookmarkEnd w:id="108"/>
-    <w:bookmarkEnd w:id="109"/>
-    <w:bookmarkStart w:id="118" w:name="kapitel-3-vom-objekt-zur-datenbank"/>
+    <w:bookmarkEnd w:id="102"/>
+    <w:bookmarkEnd w:id="103"/>
+    <w:bookmarkStart w:id="112" w:name="kapitel-3-vom-objekt-zur-datenbank"/>
     <w:p>
       <w:pPr>
         <w:pStyle w:val="Heading1"/>
@@ -8225,7 +7917,7 @@
         <w:t xml:space="preserve">Kapitel 3 – Vom Objekt zur Datenbank</w:t>
       </w:r>
     </w:p>
-    <w:bookmarkStart w:id="110" w:name="einstieg-8"/>
+    <w:bookmarkStart w:id="104" w:name="einstieg-8"/>
     <w:p>
       <w:pPr>
         <w:pStyle w:val="Heading2"/>
@@ -8299,8 +7991,8 @@
         </w:pict>
       </w:r>
     </w:p>
-    <w:bookmarkEnd w:id="110"/>
-    <w:bookmarkStart w:id="111" w:name="erinnerung"/>
+    <w:bookmarkEnd w:id="104"/>
+    <w:bookmarkStart w:id="105" w:name="erinnerung"/>
     <w:p>
       <w:pPr>
         <w:pStyle w:val="Heading2"/>
@@ -8428,8 +8120,8 @@
         </w:pict>
       </w:r>
     </w:p>
-    <w:bookmarkEnd w:id="111"/>
-    <w:bookmarkStart w:id="112" w:name="aufgabe-1-weitere-objekte"/>
+    <w:bookmarkEnd w:id="105"/>
+    <w:bookmarkStart w:id="106" w:name="aufgabe-1-weitere-objekte"/>
     <w:p>
       <w:pPr>
         <w:pStyle w:val="Heading2"/>
@@ -8701,8 +8393,8 @@
         </w:pict>
       </w:r>
     </w:p>
-    <w:bookmarkEnd w:id="112"/>
-    <w:bookmarkStart w:id="113" w:name="aufgabe-2-was-fällt-euch-auf"/>
+    <w:bookmarkEnd w:id="106"/>
+    <w:bookmarkStart w:id="107" w:name="aufgabe-2-was-fällt-euch-auf"/>
     <w:p>
       <w:pPr>
         <w:pStyle w:val="Heading2"/>
@@ -8791,8 +8483,8 @@
         </w:pict>
       </w:r>
     </w:p>
-    <w:bookmarkEnd w:id="113"/>
-    <w:bookmarkStart w:id="114" w:name="aufgabe-3-vom-objekt-zur-tabelle"/>
+    <w:bookmarkEnd w:id="107"/>
+    <w:bookmarkStart w:id="108" w:name="aufgabe-3-vom-objekt-zur-tabelle"/>
     <w:p>
       <w:pPr>
         <w:pStyle w:val="Heading2"/>
@@ -8931,8 +8623,8 @@
         </w:pict>
       </w:r>
     </w:p>
-    <w:bookmarkEnd w:id="114"/>
-    <w:bookmarkStart w:id="115" w:name="aufgabe-4-übertragt-euer-wissen"/>
+    <w:bookmarkEnd w:id="108"/>
+    <w:bookmarkStart w:id="109" w:name="aufgabe-4-übertragt-euer-wissen"/>
     <w:p>
       <w:pPr>
         <w:pStyle w:val="Heading2"/>
@@ -9063,8 +8755,8 @@
         </w:pict>
       </w:r>
     </w:p>
-    <w:bookmarkEnd w:id="115"/>
-    <w:bookmarkStart w:id="116" w:name="merkkasten-4"/>
+    <w:bookmarkEnd w:id="109"/>
+    <w:bookmarkStart w:id="110" w:name="merkkasten-4"/>
     <w:p>
       <w:pPr>
         <w:pStyle w:val="Heading2"/>
@@ -9112,8 +8804,8 @@
         </w:pict>
       </w:r>
     </w:p>
-    <w:bookmarkEnd w:id="116"/>
-    <w:bookmarkStart w:id="117" w:name="das-nehmen-wir-mit-9"/>
+    <w:bookmarkEnd w:id="110"/>
+    <w:bookmarkStart w:id="111" w:name="das-nehmen-wir-mit-9"/>
     <w:p>
       <w:pPr>
         <w:pStyle w:val="Heading2"/>
@@ -9167,9 +8859,9 @@
         <w:br w:type="page"/>
       </w:r>
     </w:p>
-    <w:bookmarkEnd w:id="117"/>
-    <w:bookmarkEnd w:id="118"/>
-    <w:bookmarkStart w:id="128" w:name="kapitel-3-klassen-werden-tabellen"/>
+    <w:bookmarkEnd w:id="111"/>
+    <w:bookmarkEnd w:id="112"/>
+    <w:bookmarkStart w:id="122" w:name="kapitel-3-klassen-werden-tabellen"/>
     <w:p>
       <w:pPr>
         <w:pStyle w:val="Heading1"/>
@@ -9178,7 +8870,7 @@
         <w:t xml:space="preserve">Kapitel 3 – Klassen werden Tabellen</w:t>
       </w:r>
     </w:p>
-    <w:bookmarkStart w:id="119" w:name="einstieg-9"/>
+    <w:bookmarkStart w:id="113" w:name="einstieg-9"/>
     <w:p>
       <w:pPr>
         <w:pStyle w:val="Heading2"/>
@@ -9262,8 +8954,8 @@
         </w:pict>
       </w:r>
     </w:p>
-    <w:bookmarkEnd w:id="119"/>
-    <w:bookmarkStart w:id="120" w:name="X372ff63dcd75bc0b02fb9e5b8e07ef2b22588b5"/>
+    <w:bookmarkEnd w:id="113"/>
+    <w:bookmarkStart w:id="114" w:name="X372ff63dcd75bc0b02fb9e5b8e07ef2b22588b5"/>
     <w:p>
       <w:pPr>
         <w:pStyle w:val="Heading2"/>
@@ -9561,8 +9253,8 @@
         </w:pict>
       </w:r>
     </w:p>
-    <w:bookmarkEnd w:id="120"/>
-    <w:bookmarkStart w:id="121" w:name="aufgabe-2-objekte-eintragen"/>
+    <w:bookmarkEnd w:id="114"/>
+    <w:bookmarkStart w:id="115" w:name="aufgabe-2-objekte-eintragen"/>
     <w:p>
       <w:pPr>
         <w:pStyle w:val="Heading2"/>
@@ -9594,8 +9286,8 @@
         </w:pict>
       </w:r>
     </w:p>
-    <w:bookmarkEnd w:id="121"/>
-    <w:bookmarkStart w:id="124" w:name="aufgabe-3-weitere-klassen"/>
+    <w:bookmarkEnd w:id="115"/>
+    <w:bookmarkStart w:id="118" w:name="aufgabe-3-weitere-klassen"/>
     <w:p>
       <w:pPr>
         <w:pStyle w:val="Heading2"/>
@@ -9644,7 +9336,7 @@
         <w:t xml:space="preserve">Überlegt zuerst gemeinsam, welche Attribute jeweils sinnvoll sind.</w:t>
       </w:r>
     </w:p>
-    <w:bookmarkStart w:id="122" w:name="helfer"/>
+    <w:bookmarkStart w:id="116" w:name="helfer"/>
     <w:p>
       <w:pPr>
         <w:pStyle w:val="Heading3"/>
@@ -9701,8 +9393,8 @@
         </w:tc>
       </w:tr>
     </w:tbl>
-    <w:bookmarkEnd w:id="122"/>
-    <w:bookmarkStart w:id="123" w:name="raum"/>
+    <w:bookmarkEnd w:id="116"/>
+    <w:bookmarkStart w:id="117" w:name="raum"/>
     <w:p>
       <w:pPr>
         <w:pStyle w:val="Heading3"/>
@@ -9766,9 +9458,9 @@
         </w:pict>
       </w:r>
     </w:p>
-    <w:bookmarkEnd w:id="123"/>
-    <w:bookmarkEnd w:id="124"/>
-    <w:bookmarkStart w:id="125" w:name="aufgabe-4-vergleichen"/>
+    <w:bookmarkEnd w:id="117"/>
+    <w:bookmarkEnd w:id="118"/>
+    <w:bookmarkStart w:id="119" w:name="aufgabe-4-vergleichen"/>
     <w:p>
       <w:pPr>
         <w:pStyle w:val="Heading2"/>
@@ -9881,8 +9573,8 @@
         </w:pict>
       </w:r>
     </w:p>
-    <w:bookmarkEnd w:id="125"/>
-    <w:bookmarkStart w:id="126" w:name="merkkasten-5"/>
+    <w:bookmarkEnd w:id="119"/>
+    <w:bookmarkStart w:id="120" w:name="merkkasten-5"/>
     <w:p>
       <w:pPr>
         <w:pStyle w:val="Heading2"/>
@@ -9985,8 +9677,8 @@
         </w:pict>
       </w:r>
     </w:p>
-    <w:bookmarkEnd w:id="126"/>
-    <w:bookmarkStart w:id="127" w:name="das-nehmen-wir-mit-10"/>
+    <w:bookmarkEnd w:id="120"/>
+    <w:bookmarkStart w:id="121" w:name="das-nehmen-wir-mit-10"/>
     <w:p>
       <w:pPr>
         <w:pStyle w:val="Heading2"/>
@@ -10024,9 +9716,9 @@
         <w:br w:type="page"/>
       </w:r>
     </w:p>
-    <w:bookmarkEnd w:id="127"/>
-    <w:bookmarkEnd w:id="128"/>
-    <w:bookmarkStart w:id="136" w:name="kapitel-3-eindeutige-ordnungsmerkmale"/>
+    <w:bookmarkEnd w:id="121"/>
+    <w:bookmarkEnd w:id="122"/>
+    <w:bookmarkStart w:id="130" w:name="kapitel-3-eindeutige-ordnungsmerkmale"/>
     <w:p>
       <w:pPr>
         <w:pStyle w:val="Heading1"/>
@@ -10035,7 +9727,7 @@
         <w:t xml:space="preserve">Kapitel 3 – Eindeutige Ordnungsmerkmale</w:t>
       </w:r>
     </w:p>
-    <w:bookmarkStart w:id="129" w:name="einstieg-10"/>
+    <w:bookmarkStart w:id="123" w:name="einstieg-10"/>
     <w:p>
       <w:pPr>
         <w:pStyle w:val="Heading2"/>
@@ -10244,8 +9936,8 @@
         </w:pict>
       </w:r>
     </w:p>
-    <w:bookmarkEnd w:id="129"/>
-    <w:bookmarkStart w:id="130" w:name="aufgabe-1-welcher-datensatz"/>
+    <w:bookmarkEnd w:id="123"/>
+    <w:bookmarkStart w:id="124" w:name="aufgabe-1-welcher-datensatz"/>
     <w:p>
       <w:pPr>
         <w:pStyle w:val="Heading2"/>
@@ -10323,8 +10015,8 @@
         </w:pict>
       </w:r>
     </w:p>
-    <w:bookmarkEnd w:id="130"/>
-    <w:bookmarkStart w:id="131" w:name="aufgabe-2-eine-bessere-lösung"/>
+    <w:bookmarkEnd w:id="124"/>
+    <w:bookmarkStart w:id="125" w:name="aufgabe-2-eine-bessere-lösung"/>
     <w:p>
       <w:pPr>
         <w:pStyle w:val="Heading2"/>
@@ -10396,8 +10088,8 @@
         </w:pict>
       </w:r>
     </w:p>
-    <w:bookmarkEnd w:id="131"/>
-    <w:bookmarkStart w:id="132" w:name="aufgabe-3-reicht-ein-merkmal"/>
+    <w:bookmarkEnd w:id="125"/>
+    <w:bookmarkStart w:id="126" w:name="aufgabe-3-reicht-ein-merkmal"/>
     <w:p>
       <w:pPr>
         <w:pStyle w:val="Heading2"/>
@@ -10713,8 +10405,8 @@
         </w:pict>
       </w:r>
     </w:p>
-    <w:bookmarkEnd w:id="132"/>
-    <w:bookmarkStart w:id="133" w:name="aufgabe-4-weitere-beispiele"/>
+    <w:bookmarkEnd w:id="126"/>
+    <w:bookmarkStart w:id="127" w:name="aufgabe-4-weitere-beispiele"/>
     <w:p>
       <w:pPr>
         <w:pStyle w:val="Heading2"/>
@@ -10883,8 +10575,8 @@
         </w:pict>
       </w:r>
     </w:p>
-    <w:bookmarkEnd w:id="133"/>
-    <w:bookmarkStart w:id="134" w:name="merkkasten-6"/>
+    <w:bookmarkEnd w:id="127"/>
+    <w:bookmarkStart w:id="128" w:name="merkkasten-6"/>
     <w:p>
       <w:pPr>
         <w:pStyle w:val="Heading2"/>
@@ -11006,8 +10698,8 @@
         </w:pict>
       </w:r>
     </w:p>
-    <w:bookmarkEnd w:id="134"/>
-    <w:bookmarkStart w:id="135" w:name="das-nehmen-wir-mit-11"/>
+    <w:bookmarkEnd w:id="128"/>
+    <w:bookmarkStart w:id="129" w:name="das-nehmen-wir-mit-11"/>
     <w:p>
       <w:pPr>
         <w:pStyle w:val="Heading2"/>
@@ -11037,9 +10729,9 @@
         <w:br w:type="page"/>
       </w:r>
     </w:p>
-    <w:bookmarkEnd w:id="135"/>
-    <w:bookmarkEnd w:id="136"/>
-    <w:bookmarkStart w:id="146" w:name="kapitel-3-tabellen-miteinander-verbinden"/>
+    <w:bookmarkEnd w:id="129"/>
+    <w:bookmarkEnd w:id="130"/>
+    <w:bookmarkStart w:id="140" w:name="kapitel-3-tabellen-miteinander-verbinden"/>
     <w:p>
       <w:pPr>
         <w:pStyle w:val="Heading1"/>
@@ -11048,7 +10740,7 @@
         <w:t xml:space="preserve">Kapitel 3 – Tabellen miteinander verbinden</w:t>
       </w:r>
     </w:p>
-    <w:bookmarkStart w:id="139" w:name="einstieg-11"/>
+    <w:bookmarkStart w:id="133" w:name="einstieg-11"/>
     <w:p>
       <w:pPr>
         <w:pStyle w:val="Heading2"/>
@@ -11065,7 +10757,7 @@
         <w:t xml:space="preserve">Für das Schülerfestival wurden bereits mehrere Tabellen erstellt.</w:t>
       </w:r>
     </w:p>
-    <w:bookmarkStart w:id="137" w:name="tabelle-band"/>
+    <w:bookmarkStart w:id="131" w:name="tabelle-band"/>
     <w:p>
       <w:pPr>
         <w:pStyle w:val="Heading3"/>
@@ -11242,8 +10934,8 @@
         </w:tc>
       </w:tr>
     </w:tbl>
-    <w:bookmarkEnd w:id="137"/>
-    <w:bookmarkStart w:id="138" w:name="tabelle-raum"/>
+    <w:bookmarkEnd w:id="131"/>
+    <w:bookmarkStart w:id="132" w:name="tabelle-raum"/>
     <w:p>
       <w:pPr>
         <w:pStyle w:val="Heading3"/>
@@ -11394,9 +11086,9 @@
         </w:pict>
       </w:r>
     </w:p>
-    <w:bookmarkEnd w:id="138"/>
-    <w:bookmarkEnd w:id="139"/>
-    <w:bookmarkStart w:id="140" w:name="aufgabe-1-was-fehlt"/>
+    <w:bookmarkEnd w:id="132"/>
+    <w:bookmarkEnd w:id="133"/>
+    <w:bookmarkStart w:id="134" w:name="aufgabe-1-was-fehlt"/>
     <w:p>
       <w:pPr>
         <w:pStyle w:val="Heading2"/>
@@ -11478,8 +11170,8 @@
         </w:pict>
       </w:r>
     </w:p>
-    <w:bookmarkEnd w:id="140"/>
-    <w:bookmarkStart w:id="141" w:name="aufgabe-2-eine-neue-idee"/>
+    <w:bookmarkEnd w:id="134"/>
+    <w:bookmarkStart w:id="135" w:name="aufgabe-2-eine-neue-idee"/>
     <w:p>
       <w:pPr>
         <w:pStyle w:val="Heading2"/>
@@ -11548,8 +11240,8 @@
         </w:pict>
       </w:r>
     </w:p>
-    <w:bookmarkEnd w:id="141"/>
-    <w:bookmarkStart w:id="142" w:name="aufgabe-3-vergleicht-eure-lösungen"/>
+    <w:bookmarkEnd w:id="135"/>
+    <w:bookmarkStart w:id="136" w:name="aufgabe-3-vergleicht-eure-lösungen"/>
     <w:p>
       <w:pPr>
         <w:pStyle w:val="Heading2"/>
@@ -11631,8 +11323,8 @@
         </w:pict>
       </w:r>
     </w:p>
-    <w:bookmarkEnd w:id="142"/>
-    <w:bookmarkStart w:id="143" w:name="aufgabe-4-weitere-beispiele-1"/>
+    <w:bookmarkEnd w:id="136"/>
+    <w:bookmarkStart w:id="137" w:name="aufgabe-4-weitere-beispiele-1"/>
     <w:p>
       <w:pPr>
         <w:pStyle w:val="Heading2"/>
@@ -11817,8 +11509,8 @@
         </w:pict>
       </w:r>
     </w:p>
-    <w:bookmarkEnd w:id="143"/>
-    <w:bookmarkStart w:id="144" w:name="merkkasten-7"/>
+    <w:bookmarkEnd w:id="137"/>
+    <w:bookmarkStart w:id="138" w:name="merkkasten-7"/>
     <w:p>
       <w:pPr>
         <w:pStyle w:val="Heading2"/>
@@ -11874,8 +11566,8 @@
         </w:pict>
       </w:r>
     </w:p>
-    <w:bookmarkEnd w:id="144"/>
-    <w:bookmarkStart w:id="145" w:name="das-nehmen-wir-mit-12"/>
+    <w:bookmarkEnd w:id="138"/>
+    <w:bookmarkStart w:id="139" w:name="das-nehmen-wir-mit-12"/>
     <w:p>
       <w:pPr>
         <w:pStyle w:val="Heading2"/>
@@ -11913,9 +11605,9 @@
         <w:br w:type="page"/>
       </w:r>
     </w:p>
-    <w:bookmarkEnd w:id="145"/>
-    <w:bookmarkEnd w:id="146"/>
-    <w:bookmarkStart w:id="154" w:name="kapitel-3-der-richtige-primärschlüssel"/>
+    <w:bookmarkEnd w:id="139"/>
+    <w:bookmarkEnd w:id="140"/>
+    <w:bookmarkStart w:id="148" w:name="kapitel-3-der-richtige-primärschlüssel"/>
     <w:p>
       <w:pPr>
         <w:pStyle w:val="Heading1"/>
@@ -11924,7 +11616,7 @@
         <w:t xml:space="preserve">Kapitel 3 – Der richtige Primärschlüssel</w:t>
       </w:r>
     </w:p>
-    <w:bookmarkStart w:id="147" w:name="einstieg-12"/>
+    <w:bookmarkStart w:id="141" w:name="einstieg-12"/>
     <w:p>
       <w:pPr>
         <w:pStyle w:val="Heading2"/>
@@ -11964,8 +11656,8 @@
         </w:pict>
       </w:r>
     </w:p>
-    <w:bookmarkEnd w:id="147"/>
-    <w:bookmarkStart w:id="148" w:name="aufgabe-1-geeignet-oder-nicht"/>
+    <w:bookmarkEnd w:id="141"/>
+    <w:bookmarkStart w:id="142" w:name="aufgabe-1-geeignet-oder-nicht"/>
     <w:p>
       <w:pPr>
         <w:pStyle w:val="Heading2"/>
@@ -12255,8 +11947,8 @@
         </w:pict>
       </w:r>
     </w:p>
-    <w:bookmarkEnd w:id="148"/>
-    <w:bookmarkStart w:id="149" w:name="Xd9cd8508961a8771efbca3452d23466e27d302d"/>
+    <w:bookmarkEnd w:id="142"/>
+    <w:bookmarkStart w:id="143" w:name="Xd9cd8508961a8771efbca3452d23466e27d302d"/>
     <w:p>
       <w:pPr>
         <w:pStyle w:val="Heading2"/>
@@ -12687,8 +12379,8 @@
         </w:pict>
       </w:r>
     </w:p>
-    <w:bookmarkEnd w:id="149"/>
-    <w:bookmarkStart w:id="150" w:name="aufgabe-3-eigene-beispiele"/>
+    <w:bookmarkEnd w:id="143"/>
+    <w:bookmarkStart w:id="144" w:name="aufgabe-3-eigene-beispiele"/>
     <w:p>
       <w:pPr>
         <w:pStyle w:val="Heading2"/>
@@ -12833,8 +12525,8 @@
         </w:pict>
       </w:r>
     </w:p>
-    <w:bookmarkEnd w:id="150"/>
-    <w:bookmarkStart w:id="151" w:name="aufgabe-4-nachdenken"/>
+    <w:bookmarkEnd w:id="144"/>
+    <w:bookmarkStart w:id="145" w:name="aufgabe-4-nachdenken"/>
     <w:p>
       <w:pPr>
         <w:pStyle w:val="Heading2"/>
@@ -12927,8 +12619,8 @@
         </w:pict>
       </w:r>
     </w:p>
-    <w:bookmarkEnd w:id="151"/>
-    <w:bookmarkStart w:id="152" w:name="merkkasten-8"/>
+    <w:bookmarkEnd w:id="145"/>
+    <w:bookmarkStart w:id="146" w:name="merkkasten-8"/>
     <w:p>
       <w:pPr>
         <w:pStyle w:val="Heading2"/>
@@ -13067,8 +12759,8 @@
         </w:pict>
       </w:r>
     </w:p>
-    <w:bookmarkEnd w:id="152"/>
-    <w:bookmarkStart w:id="153" w:name="das-nehmen-wir-mit-13"/>
+    <w:bookmarkEnd w:id="146"/>
+    <w:bookmarkStart w:id="147" w:name="das-nehmen-wir-mit-13"/>
     <w:p>
       <w:pPr>
         <w:pStyle w:val="Heading2"/>
@@ -13098,9 +12790,9 @@
         <w:br w:type="page"/>
       </w:r>
     </w:p>
-    <w:bookmarkEnd w:id="153"/>
-    <w:bookmarkEnd w:id="154"/>
-    <w:bookmarkStart w:id="164" w:name="X3e926df677791736be08ba9ef74b904cd578df4"/>
+    <w:bookmarkEnd w:id="147"/>
+    <w:bookmarkEnd w:id="148"/>
+    <w:bookmarkStart w:id="158" w:name="X3e926df677791736be08ba9ef74b904cd578df4"/>
     <w:p>
       <w:pPr>
         <w:pStyle w:val="Heading1"/>
@@ -13109,7 +12801,7 @@
         <w:t xml:space="preserve">Kapitel 3 – Tabellen miteinander verbinden</w:t>
       </w:r>
     </w:p>
-    <w:bookmarkStart w:id="157" w:name="einstieg-13"/>
+    <w:bookmarkStart w:id="151" w:name="einstieg-13"/>
     <w:p>
       <w:pPr>
         <w:pStyle w:val="Heading2"/>
@@ -13126,7 +12818,7 @@
         <w:t xml:space="preserve">Die Planungsgruppe verwaltet zwei Tabellen.</w:t>
       </w:r>
     </w:p>
-    <w:bookmarkStart w:id="155" w:name="tabelle-helfer"/>
+    <w:bookmarkStart w:id="149" w:name="tabelle-helfer"/>
     <w:p>
       <w:pPr>
         <w:pStyle w:val="Heading3"/>
@@ -13254,8 +12946,8 @@
         </w:tc>
       </w:tr>
     </w:tbl>
-    <w:bookmarkEnd w:id="155"/>
-    <w:bookmarkStart w:id="156" w:name="tabelle-einsatz"/>
+    <w:bookmarkEnd w:id="149"/>
+    <w:bookmarkStart w:id="150" w:name="tabelle-einsatz"/>
     <w:p>
       <w:pPr>
         <w:pStyle w:val="Heading3"/>
@@ -13607,9 +13299,9 @@
         </w:pict>
       </w:r>
     </w:p>
-    <w:bookmarkEnd w:id="156"/>
-    <w:bookmarkEnd w:id="157"/>
-    <w:bookmarkStart w:id="158" w:name="aufgabe-1-informationen-finden"/>
+    <w:bookmarkEnd w:id="150"/>
+    <w:bookmarkEnd w:id="151"/>
+    <w:bookmarkStart w:id="152" w:name="aufgabe-1-informationen-finden"/>
     <w:p>
       <w:pPr>
         <w:pStyle w:val="Heading2"/>
@@ -13704,8 +13396,8 @@
         </w:pict>
       </w:r>
     </w:p>
-    <w:bookmarkEnd w:id="158"/>
-    <w:bookmarkStart w:id="159" w:name="X8c84f88fff0235769d3d93fafbe73ed265f4564"/>
+    <w:bookmarkEnd w:id="152"/>
+    <w:bookmarkStart w:id="153" w:name="X8c84f88fff0235769d3d93fafbe73ed265f4564"/>
     <w:p>
       <w:pPr>
         <w:pStyle w:val="Heading2"/>
@@ -13782,8 +13474,8 @@
         </w:pict>
       </w:r>
     </w:p>
-    <w:bookmarkEnd w:id="159"/>
-    <w:bookmarkStart w:id="160" w:name="Xe8e603127f737bba10d37417ff01b28b22255f9"/>
+    <w:bookmarkEnd w:id="153"/>
+    <w:bookmarkStart w:id="154" w:name="Xe8e603127f737bba10d37417ff01b28b22255f9"/>
     <w:p>
       <w:pPr>
         <w:pStyle w:val="Heading2"/>
@@ -13874,8 +13566,8 @@
         </w:pict>
       </w:r>
     </w:p>
-    <w:bookmarkEnd w:id="160"/>
-    <w:bookmarkStart w:id="161" w:name="aufgabe-4-verbindungen-erkennen"/>
+    <w:bookmarkEnd w:id="154"/>
+    <w:bookmarkStart w:id="155" w:name="aufgabe-4-verbindungen-erkennen"/>
     <w:p>
       <w:pPr>
         <w:pStyle w:val="Heading2"/>
@@ -13961,8 +13653,8 @@
         </w:pict>
       </w:r>
     </w:p>
-    <w:bookmarkEnd w:id="161"/>
-    <w:bookmarkStart w:id="162" w:name="merkkasten-9"/>
+    <w:bookmarkEnd w:id="155"/>
+    <w:bookmarkStart w:id="156" w:name="merkkasten-9"/>
     <w:p>
       <w:pPr>
         <w:pStyle w:val="Heading2"/>
@@ -14031,8 +13723,8 @@
         </w:pict>
       </w:r>
     </w:p>
-    <w:bookmarkEnd w:id="162"/>
-    <w:bookmarkStart w:id="163" w:name="das-nehmen-wir-mit-14"/>
+    <w:bookmarkEnd w:id="156"/>
+    <w:bookmarkStart w:id="157" w:name="das-nehmen-wir-mit-14"/>
     <w:p>
       <w:pPr>
         <w:pStyle w:val="Heading2"/>
@@ -14062,9 +13754,9 @@
         <w:br w:type="page"/>
       </w:r>
     </w:p>
-    <w:bookmarkEnd w:id="163"/>
-    <w:bookmarkEnd w:id="164"/>
-    <w:bookmarkStart w:id="174" w:name="kapitel-3-beziehungen-zwischen-tabellen"/>
+    <w:bookmarkEnd w:id="157"/>
+    <w:bookmarkEnd w:id="158"/>
+    <w:bookmarkStart w:id="168" w:name="kapitel-3-beziehungen-zwischen-tabellen"/>
     <w:p>
       <w:pPr>
         <w:pStyle w:val="Heading1"/>
@@ -14073,7 +13765,7 @@
         <w:t xml:space="preserve">Kapitel 3 – Beziehungen zwischen Tabellen</w:t>
       </w:r>
     </w:p>
-    <w:bookmarkStart w:id="165" w:name="einstieg-14"/>
+    <w:bookmarkStart w:id="159" w:name="einstieg-14"/>
     <w:p>
       <w:pPr>
         <w:pStyle w:val="Heading2"/>
@@ -14162,8 +13854,8 @@
         </w:pict>
       </w:r>
     </w:p>
-    <w:bookmarkEnd w:id="165"/>
-    <w:bookmarkStart w:id="166" w:name="aufgabe-1-beziehungen-erkennen"/>
+    <w:bookmarkEnd w:id="159"/>
+    <w:bookmarkStart w:id="160" w:name="aufgabe-1-beziehungen-erkennen"/>
     <w:p>
       <w:pPr>
         <w:pStyle w:val="Heading2"/>
@@ -14324,8 +14016,8 @@
         </w:pict>
       </w:r>
     </w:p>
-    <w:bookmarkEnd w:id="166"/>
-    <w:bookmarkStart w:id="169" w:name="aufgabe-2-wie-viele"/>
+    <w:bookmarkEnd w:id="160"/>
+    <w:bookmarkStart w:id="163" w:name="aufgabe-2-wie-viele"/>
     <w:p>
       <w:pPr>
         <w:pStyle w:val="Heading2"/>
@@ -14342,7 +14034,7 @@
         <w:t xml:space="preserve">Ergänzt.</w:t>
       </w:r>
     </w:p>
-    <w:bookmarkStart w:id="167" w:name="helfer-einsatz"/>
+    <w:bookmarkStart w:id="161" w:name="helfer-einsatz"/>
     <w:p>
       <w:pPr>
         <w:pStyle w:val="Heading3"/>
@@ -14374,8 +14066,8 @@
         </w:pict>
       </w:r>
     </w:p>
-    <w:bookmarkEnd w:id="167"/>
-    <w:bookmarkStart w:id="168" w:name="band-bühne"/>
+    <w:bookmarkEnd w:id="161"/>
+    <w:bookmarkStart w:id="162" w:name="band-bühne"/>
     <w:p>
       <w:pPr>
         <w:pStyle w:val="Heading3"/>
@@ -14407,9 +14099,9 @@
         </w:pict>
       </w:r>
     </w:p>
-    <w:bookmarkEnd w:id="168"/>
-    <w:bookmarkEnd w:id="169"/>
-    <w:bookmarkStart w:id="170" w:name="aufgabe-3-weitere-beispiele"/>
+    <w:bookmarkEnd w:id="162"/>
+    <w:bookmarkEnd w:id="163"/>
+    <w:bookmarkStart w:id="164" w:name="aufgabe-3-weitere-beispiele"/>
     <w:p>
       <w:pPr>
         <w:pStyle w:val="Heading2"/>
@@ -14607,8 +14299,8 @@
         </w:pict>
       </w:r>
     </w:p>
-    <w:bookmarkEnd w:id="170"/>
-    <w:bookmarkStart w:id="171" w:name="aufgabe-4-nachdenken-1"/>
+    <w:bookmarkEnd w:id="164"/>
+    <w:bookmarkStart w:id="165" w:name="aufgabe-4-nachdenken-1"/>
     <w:p>
       <w:pPr>
         <w:pStyle w:val="Heading2"/>
@@ -14705,8 +14397,8 @@
         </w:pict>
       </w:r>
     </w:p>
-    <w:bookmarkEnd w:id="171"/>
-    <w:bookmarkStart w:id="172" w:name="merkkasten-10"/>
+    <w:bookmarkEnd w:id="165"/>
+    <w:bookmarkStart w:id="166" w:name="merkkasten-10"/>
     <w:p>
       <w:pPr>
         <w:pStyle w:val="Heading2"/>
@@ -14754,8 +14446,8 @@
         </w:pict>
       </w:r>
     </w:p>
-    <w:bookmarkEnd w:id="172"/>
-    <w:bookmarkStart w:id="173" w:name="das-nehmen-wir-mit-15"/>
+    <w:bookmarkEnd w:id="166"/>
+    <w:bookmarkStart w:id="167" w:name="das-nehmen-wir-mit-15"/>
     <w:p>
       <w:pPr>
         <w:pStyle w:val="Heading2"/>
@@ -14785,9 +14477,9 @@
         <w:br w:type="page"/>
       </w:r>
     </w:p>
-    <w:bookmarkEnd w:id="173"/>
-    <w:bookmarkEnd w:id="174"/>
-    <w:bookmarkStart w:id="182" w:name="kapitel-3-beziehungen-beschreiben"/>
+    <w:bookmarkEnd w:id="167"/>
+    <w:bookmarkEnd w:id="168"/>
+    <w:bookmarkStart w:id="176" w:name="kapitel-3-beziehungen-beschreiben"/>
     <w:p>
       <w:pPr>
         <w:pStyle w:val="Heading1"/>
@@ -14796,7 +14488,7 @@
         <w:t xml:space="preserve">Kapitel 3 – Beziehungen beschreiben</w:t>
       </w:r>
     </w:p>
-    <w:bookmarkStart w:id="175" w:name="einstieg-15"/>
+    <w:bookmarkStart w:id="169" w:name="einstieg-15"/>
     <w:p>
       <w:pPr>
         <w:pStyle w:val="Heading2"/>
@@ -14860,8 +14552,8 @@
         </w:pict>
       </w:r>
     </w:p>
-    <w:bookmarkEnd w:id="175"/>
-    <w:bookmarkStart w:id="176" w:name="aufgabe-1-aussagen-zuordnen"/>
+    <w:bookmarkEnd w:id="169"/>
+    <w:bookmarkStart w:id="170" w:name="aufgabe-1-aussagen-zuordnen"/>
     <w:p>
       <w:pPr>
         <w:pStyle w:val="Heading2"/>
@@ -15036,8 +14728,8 @@
         </w:pict>
       </w:r>
     </w:p>
-    <w:bookmarkEnd w:id="176"/>
-    <w:bookmarkStart w:id="177" w:name="aufgabe-2-das-festival"/>
+    <w:bookmarkEnd w:id="170"/>
+    <w:bookmarkStart w:id="171" w:name="aufgabe-2-das-festival"/>
     <w:p>
       <w:pPr>
         <w:pStyle w:val="Heading2"/>
@@ -15212,8 +14904,8 @@
         </w:pict>
       </w:r>
     </w:p>
-    <w:bookmarkEnd w:id="177"/>
-    <w:bookmarkStart w:id="178" w:name="aufgabe-3-eigene-beispiele-1"/>
+    <w:bookmarkEnd w:id="171"/>
+    <w:bookmarkStart w:id="172" w:name="aufgabe-3-eigene-beispiele-1"/>
     <w:p>
       <w:pPr>
         <w:pStyle w:val="Heading2"/>
@@ -15344,8 +15036,8 @@
         </w:pict>
       </w:r>
     </w:p>
-    <w:bookmarkEnd w:id="178"/>
-    <w:bookmarkStart w:id="179" w:name="aufgabe-4-nachdenken-2"/>
+    <w:bookmarkEnd w:id="172"/>
+    <w:bookmarkStart w:id="173" w:name="aufgabe-4-nachdenken-2"/>
     <w:p>
       <w:pPr>
         <w:pStyle w:val="Heading2"/>
@@ -15406,8 +15098,8 @@
         </w:pict>
       </w:r>
     </w:p>
-    <w:bookmarkEnd w:id="179"/>
-    <w:bookmarkStart w:id="180" w:name="merkkasten-11"/>
+    <w:bookmarkEnd w:id="173"/>
+    <w:bookmarkStart w:id="174" w:name="merkkasten-11"/>
     <w:p>
       <w:pPr>
         <w:pStyle w:val="Heading2"/>
@@ -15491,8 +15183,8 @@
         </w:pict>
       </w:r>
     </w:p>
-    <w:bookmarkEnd w:id="180"/>
-    <w:bookmarkStart w:id="181" w:name="das-nehmen-wir-mit-16"/>
+    <w:bookmarkEnd w:id="174"/>
+    <w:bookmarkStart w:id="175" w:name="das-nehmen-wir-mit-16"/>
     <w:p>
       <w:pPr>
         <w:pStyle w:val="Heading2"/>
@@ -15530,9 +15222,9 @@
         <w:br w:type="page"/>
       </w:r>
     </w:p>
-    <w:bookmarkEnd w:id="181"/>
-    <w:bookmarkEnd w:id="182"/>
-    <w:bookmarkStart w:id="190" w:name="kapitel-4-informationen-finden"/>
+    <w:bookmarkEnd w:id="175"/>
+    <w:bookmarkEnd w:id="176"/>
+    <w:bookmarkStart w:id="184" w:name="kapitel-4-informationen-finden"/>
     <w:p>
       <w:pPr>
         <w:pStyle w:val="Heading1"/>
@@ -15541,7 +15233,7 @@
         <w:t xml:space="preserve">Kapitel 4 – Informationen finden</w:t>
       </w:r>
     </w:p>
-    <w:bookmarkStart w:id="183" w:name="einstieg-16"/>
+    <w:bookmarkStart w:id="177" w:name="einstieg-16"/>
     <w:p>
       <w:pPr>
         <w:pStyle w:val="Heading2"/>
@@ -15637,8 +15329,8 @@
         </w:pict>
       </w:r>
     </w:p>
-    <w:bookmarkEnd w:id="183"/>
-    <w:bookmarkStart w:id="184" w:name="aufgabe-1-gesucht"/>
+    <w:bookmarkEnd w:id="177"/>
+    <w:bookmarkStart w:id="178" w:name="aufgabe-1-gesucht"/>
     <w:p>
       <w:pPr>
         <w:pStyle w:val="Heading2"/>
@@ -16124,8 +15816,8 @@
         </w:pict>
       </w:r>
     </w:p>
-    <w:bookmarkEnd w:id="184"/>
-    <w:bookmarkStart w:id="185" w:name="aufgabe-2-eigene-fragen"/>
+    <w:bookmarkEnd w:id="178"/>
+    <w:bookmarkStart w:id="179" w:name="aufgabe-2-eigene-fragen"/>
     <w:p>
       <w:pPr>
         <w:pStyle w:val="Heading2"/>
@@ -16170,8 +15862,8 @@
         </w:pict>
       </w:r>
     </w:p>
-    <w:bookmarkEnd w:id="185"/>
-    <w:bookmarkStart w:id="186" w:name="aufgabe-3-welche-informationen-fehlen"/>
+    <w:bookmarkEnd w:id="179"/>
+    <w:bookmarkStart w:id="180" w:name="aufgabe-3-welche-informationen-fehlen"/>
     <w:p>
       <w:pPr>
         <w:pStyle w:val="Heading2"/>
@@ -16240,8 +15932,8 @@
         </w:pict>
       </w:r>
     </w:p>
-    <w:bookmarkEnd w:id="186"/>
-    <w:bookmarkStart w:id="187" w:name="aufgabe-4-warum-ist-das-wichtig"/>
+    <w:bookmarkEnd w:id="180"/>
+    <w:bookmarkStart w:id="181" w:name="aufgabe-4-warum-ist-das-wichtig"/>
     <w:p>
       <w:pPr>
         <w:pStyle w:val="Heading2"/>
@@ -16302,8 +15994,8 @@
         </w:pict>
       </w:r>
     </w:p>
-    <w:bookmarkEnd w:id="187"/>
-    <w:bookmarkStart w:id="188" w:name="merkkasten-12"/>
+    <w:bookmarkEnd w:id="181"/>
+    <w:bookmarkStart w:id="182" w:name="merkkasten-12"/>
     <w:p>
       <w:pPr>
         <w:pStyle w:val="Heading2"/>
@@ -16356,8 +16048,8 @@
         </w:pict>
       </w:r>
     </w:p>
-    <w:bookmarkEnd w:id="188"/>
-    <w:bookmarkStart w:id="189" w:name="das-nehmen-wir-mit-17"/>
+    <w:bookmarkEnd w:id="182"/>
+    <w:bookmarkStart w:id="183" w:name="das-nehmen-wir-mit-17"/>
     <w:p>
       <w:pPr>
         <w:pStyle w:val="Heading2"/>
@@ -16395,9 +16087,9 @@
         <w:br w:type="page"/>
       </w:r>
     </w:p>
-    <w:bookmarkEnd w:id="189"/>
-    <w:bookmarkEnd w:id="190"/>
-    <w:bookmarkStart w:id="198" w:name="kapitel-4-suchen"/>
+    <w:bookmarkEnd w:id="183"/>
+    <w:bookmarkEnd w:id="184"/>
+    <w:bookmarkStart w:id="192" w:name="kapitel-4-suchen"/>
     <w:p>
       <w:pPr>
         <w:pStyle w:val="Heading1"/>
@@ -16406,7 +16098,7 @@
         <w:t xml:space="preserve">Kapitel 4 – Suchen</w:t>
       </w:r>
     </w:p>
-    <w:bookmarkStart w:id="191" w:name="einstieg-17"/>
+    <w:bookmarkStart w:id="185" w:name="einstieg-17"/>
     <w:p>
       <w:pPr>
         <w:pStyle w:val="Heading2"/>
@@ -16475,8 +16167,8 @@
         </w:pict>
       </w:r>
     </w:p>
-    <w:bookmarkEnd w:id="191"/>
-    <w:bookmarkStart w:id="192" w:name="aufgabe-1-gesucht-1"/>
+    <w:bookmarkEnd w:id="185"/>
+    <w:bookmarkStart w:id="186" w:name="aufgabe-1-gesucht-1"/>
     <w:p>
       <w:pPr>
         <w:pStyle w:val="Heading2"/>
@@ -16968,8 +16660,8 @@
         </w:pict>
       </w:r>
     </w:p>
-    <w:bookmarkEnd w:id="192"/>
-    <w:bookmarkStart w:id="193" w:name="aufgabe-2-weitere-suchaufträge"/>
+    <w:bookmarkEnd w:id="186"/>
+    <w:bookmarkStart w:id="187" w:name="aufgabe-2-weitere-suchaufträge"/>
     <w:p>
       <w:pPr>
         <w:pStyle w:val="Heading2"/>
@@ -17134,8 +16826,8 @@
         </w:pict>
       </w:r>
     </w:p>
-    <w:bookmarkEnd w:id="193"/>
-    <w:bookmarkStart w:id="194" w:name="aufgabe-3-nachdenken"/>
+    <w:bookmarkEnd w:id="187"/>
+    <w:bookmarkStart w:id="188" w:name="aufgabe-3-nachdenken"/>
     <w:p>
       <w:pPr>
         <w:pStyle w:val="Heading2"/>
@@ -17213,8 +16905,8 @@
         </w:pict>
       </w:r>
     </w:p>
-    <w:bookmarkEnd w:id="194"/>
-    <w:bookmarkStart w:id="195" w:name="aufgabe-4-wo-suchst-du-im-alltag"/>
+    <w:bookmarkEnd w:id="188"/>
+    <w:bookmarkStart w:id="189" w:name="aufgabe-4-wo-suchst-du-im-alltag"/>
     <w:p>
       <w:pPr>
         <w:pStyle w:val="Heading2"/>
@@ -17294,8 +16986,8 @@
         </w:pict>
       </w:r>
     </w:p>
-    <w:bookmarkEnd w:id="195"/>
-    <w:bookmarkStart w:id="196" w:name="merkkasten-13"/>
+    <w:bookmarkEnd w:id="189"/>
+    <w:bookmarkStart w:id="190" w:name="merkkasten-13"/>
     <w:p>
       <w:pPr>
         <w:pStyle w:val="Heading2"/>
@@ -17374,8 +17066,8 @@
         </w:pict>
       </w:r>
     </w:p>
-    <w:bookmarkEnd w:id="196"/>
-    <w:bookmarkStart w:id="197" w:name="das-nehmen-wir-mit-18"/>
+    <w:bookmarkEnd w:id="190"/>
+    <w:bookmarkStart w:id="191" w:name="das-nehmen-wir-mit-18"/>
     <w:p>
       <w:pPr>
         <w:pStyle w:val="Heading2"/>
@@ -17413,9 +17105,9 @@
         <w:br w:type="page"/>
       </w:r>
     </w:p>
-    <w:bookmarkEnd w:id="197"/>
-    <w:bookmarkEnd w:id="198"/>
-    <w:bookmarkStart w:id="209" w:name="kapitel-4-filtern"/>
+    <w:bookmarkEnd w:id="191"/>
+    <w:bookmarkEnd w:id="192"/>
+    <w:bookmarkStart w:id="203" w:name="kapitel-4-filtern"/>
     <w:p>
       <w:pPr>
         <w:pStyle w:val="Heading1"/>
@@ -17424,7 +17116,7 @@
         <w:t xml:space="preserve">Kapitel 4 – Filtern</w:t>
       </w:r>
     </w:p>
-    <w:bookmarkStart w:id="199" w:name="einstieg-18"/>
+    <w:bookmarkStart w:id="193" w:name="einstieg-18"/>
     <w:p>
       <w:pPr>
         <w:pStyle w:val="Heading2"/>
@@ -17501,8 +17193,8 @@
         </w:pict>
       </w:r>
     </w:p>
-    <w:bookmarkEnd w:id="199"/>
-    <w:bookmarkStart w:id="200" w:name="Xe7356d2bf69649c807f454aca650afd10111d4c"/>
+    <w:bookmarkEnd w:id="193"/>
+    <w:bookmarkStart w:id="194" w:name="Xe7356d2bf69649c807f454aca650afd10111d4c"/>
     <w:p>
       <w:pPr>
         <w:pStyle w:val="Heading2"/>
@@ -18031,8 +17723,8 @@
         </w:pict>
       </w:r>
     </w:p>
-    <w:bookmarkEnd w:id="200"/>
-    <w:bookmarkStart w:id="204" w:name="aufgabe-2-weitere-filter"/>
+    <w:bookmarkEnd w:id="194"/>
+    <w:bookmarkStart w:id="198" w:name="aufgabe-2-weitere-filter"/>
     <w:p>
       <w:pPr>
         <w:pStyle w:val="Heading2"/>
@@ -18049,7 +17741,7 @@
         <w:t xml:space="preserve">Findet alle Datensätze, die passen.</w:t>
       </w:r>
     </w:p>
-    <w:bookmarkStart w:id="201" w:name="a-eigene-technik-ja"/>
+    <w:bookmarkStart w:id="195" w:name="a-eigene-technik-ja"/>
     <w:p>
       <w:pPr>
         <w:pStyle w:val="Heading3"/>
@@ -18072,8 +17764,8 @@
         </w:pict>
       </w:r>
     </w:p>
-    <w:bookmarkEnd w:id="201"/>
-    <w:bookmarkStart w:id="202" w:name="b-bühne-b"/>
+    <w:bookmarkEnd w:id="195"/>
+    <w:bookmarkStart w:id="196" w:name="b-bühne-b"/>
     <w:p>
       <w:pPr>
         <w:pStyle w:val="Heading3"/>
@@ -18096,8 +17788,8 @@
         </w:pict>
       </w:r>
     </w:p>
-    <w:bookmarkEnd w:id="202"/>
-    <w:bookmarkStart w:id="203" w:name="c-beginn-nach-1400-uhr"/>
+    <w:bookmarkEnd w:id="196"/>
+    <w:bookmarkStart w:id="197" w:name="c-beginn-nach-1400-uhr"/>
     <w:p>
       <w:pPr>
         <w:pStyle w:val="Heading3"/>
@@ -18127,9 +17819,9 @@
         </w:pict>
       </w:r>
     </w:p>
-    <w:bookmarkEnd w:id="203"/>
-    <w:bookmarkEnd w:id="204"/>
-    <w:bookmarkStart w:id="205" w:name="aufgabe-3-eigene-filter"/>
+    <w:bookmarkEnd w:id="197"/>
+    <w:bookmarkEnd w:id="198"/>
+    <w:bookmarkStart w:id="199" w:name="aufgabe-3-eigene-filter"/>
     <w:p>
       <w:pPr>
         <w:pStyle w:val="Heading2"/>
@@ -18174,8 +17866,8 @@
         </w:pict>
       </w:r>
     </w:p>
-    <w:bookmarkEnd w:id="205"/>
-    <w:bookmarkStart w:id="206" w:name="aufgabe-4-vergleicht"/>
+    <w:bookmarkEnd w:id="199"/>
+    <w:bookmarkStart w:id="200" w:name="aufgabe-4-vergleicht"/>
     <w:p>
       <w:pPr>
         <w:pStyle w:val="Heading2"/>
@@ -18308,8 +18000,8 @@
         </w:pict>
       </w:r>
     </w:p>
-    <w:bookmarkEnd w:id="206"/>
-    <w:bookmarkStart w:id="207" w:name="merkkasten-14"/>
+    <w:bookmarkEnd w:id="200"/>
+    <w:bookmarkStart w:id="201" w:name="merkkasten-14"/>
     <w:p>
       <w:pPr>
         <w:pStyle w:val="Heading2"/>
@@ -18409,8 +18101,8 @@
         </w:pict>
       </w:r>
     </w:p>
-    <w:bookmarkEnd w:id="207"/>
-    <w:bookmarkStart w:id="208" w:name="das-nehmen-wir-mit-19"/>
+    <w:bookmarkEnd w:id="201"/>
+    <w:bookmarkStart w:id="202" w:name="das-nehmen-wir-mit-19"/>
     <w:p>
       <w:pPr>
         <w:pStyle w:val="Heading2"/>
@@ -18456,9 +18148,9 @@
         <w:br w:type="page"/>
       </w:r>
     </w:p>
-    <w:bookmarkEnd w:id="208"/>
-    <w:bookmarkEnd w:id="209"/>
-    <w:bookmarkStart w:id="210" w:name="mehrere-bedingungen"/>
+    <w:bookmarkEnd w:id="202"/>
+    <w:bookmarkEnd w:id="203"/>
+    <w:bookmarkStart w:id="204" w:name="mehrere-bedingungen"/>
     <w:p>
       <w:pPr>
         <w:pStyle w:val="Heading1"/>
@@ -18472,8 +18164,8 @@
         <w:br w:type="page"/>
       </w:r>
     </w:p>
-    <w:bookmarkEnd w:id="210"/>
-    <w:bookmarkStart w:id="219" w:name="kapitel-4-sortieren"/>
+    <w:bookmarkEnd w:id="204"/>
+    <w:bookmarkStart w:id="213" w:name="kapitel-4-sortieren"/>
     <w:p>
       <w:pPr>
         <w:pStyle w:val="Heading1"/>
@@ -18482,7 +18174,7 @@
         <w:t xml:space="preserve">Kapitel 4 – Sortieren</w:t>
       </w:r>
     </w:p>
-    <w:bookmarkStart w:id="211" w:name="einstieg-19"/>
+    <w:bookmarkStart w:id="205" w:name="einstieg-19"/>
     <w:p>
       <w:pPr>
         <w:pStyle w:val="Heading2"/>
@@ -18570,8 +18262,8 @@
         </w:pict>
       </w:r>
     </w:p>
-    <w:bookmarkEnd w:id="211"/>
-    <w:bookmarkStart w:id="212" w:name="aufgabe-1-nach-der-uhrzeit-sortieren"/>
+    <w:bookmarkEnd w:id="205"/>
+    <w:bookmarkStart w:id="206" w:name="aufgabe-1-nach-der-uhrzeit-sortieren"/>
     <w:p>
       <w:pPr>
         <w:pStyle w:val="Heading2"/>
@@ -18949,8 +18641,8 @@
         </w:pict>
       </w:r>
     </w:p>
-    <w:bookmarkEnd w:id="212"/>
-    <w:bookmarkStart w:id="213" w:name="aufgabe-2-nach-dem-namen-sortieren"/>
+    <w:bookmarkEnd w:id="206"/>
+    <w:bookmarkStart w:id="207" w:name="aufgabe-2-nach-dem-namen-sortieren"/>
     <w:p>
       <w:pPr>
         <w:pStyle w:val="Heading2"/>
@@ -18996,8 +18688,8 @@
         </w:pict>
       </w:r>
     </w:p>
-    <w:bookmarkEnd w:id="213"/>
-    <w:bookmarkStart w:id="214" w:name="aufgabe-3-welche-sortierung-hilft"/>
+    <w:bookmarkEnd w:id="207"/>
+    <w:bookmarkStart w:id="208" w:name="aufgabe-3-welche-sortierung-hilft"/>
     <w:p>
       <w:pPr>
         <w:pStyle w:val="Heading2"/>
@@ -19188,8 +18880,8 @@
         </w:pict>
       </w:r>
     </w:p>
-    <w:bookmarkEnd w:id="214"/>
-    <w:bookmarkStart w:id="215" w:name="aufgabe-4-sortieren-oder-filtern"/>
+    <w:bookmarkEnd w:id="208"/>
+    <w:bookmarkStart w:id="209" w:name="aufgabe-4-sortieren-oder-filtern"/>
     <w:p>
       <w:pPr>
         <w:pStyle w:val="Heading2"/>
@@ -19457,8 +19149,8 @@
         </w:pict>
       </w:r>
     </w:p>
-    <w:bookmarkEnd w:id="215"/>
-    <w:bookmarkStart w:id="216" w:name="aufgabe-5-nachdenken"/>
+    <w:bookmarkEnd w:id="209"/>
+    <w:bookmarkStart w:id="210" w:name="aufgabe-5-nachdenken"/>
     <w:p>
       <w:pPr>
         <w:pStyle w:val="Heading2"/>
@@ -19535,8 +19227,8 @@
         </w:pict>
       </w:r>
     </w:p>
-    <w:bookmarkEnd w:id="216"/>
-    <w:bookmarkStart w:id="217" w:name="merkkasten-15"/>
+    <w:bookmarkEnd w:id="210"/>
+    <w:bookmarkStart w:id="211" w:name="merkkasten-15"/>
     <w:p>
       <w:pPr>
         <w:pStyle w:val="Heading2"/>
@@ -19653,8 +19345,8 @@
         </w:pict>
       </w:r>
     </w:p>
-    <w:bookmarkEnd w:id="217"/>
-    <w:bookmarkStart w:id="218" w:name="das-nehmen-wir-mit-20"/>
+    <w:bookmarkEnd w:id="211"/>
+    <w:bookmarkStart w:id="212" w:name="das-nehmen-wir-mit-20"/>
     <w:p>
       <w:pPr>
         <w:pStyle w:val="Heading2"/>
@@ -19734,9 +19426,9 @@
         <w:br w:type="page"/>
       </w:r>
     </w:p>
-    <w:bookmarkEnd w:id="218"/>
-    <w:bookmarkEnd w:id="219"/>
-    <w:bookmarkStart w:id="227" w:name="kapitel-4-welches-werkzeug-passt"/>
+    <w:bookmarkEnd w:id="212"/>
+    <w:bookmarkEnd w:id="213"/>
+    <w:bookmarkStart w:id="221" w:name="kapitel-4-welches-werkzeug-passt"/>
     <w:p>
       <w:pPr>
         <w:pStyle w:val="Heading1"/>
@@ -19745,7 +19437,7 @@
         <w:t xml:space="preserve">Kapitel 4 – Welches Werkzeug passt?</w:t>
       </w:r>
     </w:p>
-    <w:bookmarkStart w:id="220" w:name="einstieg-20"/>
+    <w:bookmarkStart w:id="214" w:name="einstieg-20"/>
     <w:p>
       <w:pPr>
         <w:pStyle w:val="Heading2"/>
@@ -19785,8 +19477,8 @@
         </w:pict>
       </w:r>
     </w:p>
-    <w:bookmarkEnd w:id="220"/>
-    <w:bookmarkStart w:id="221" w:name="aufgabe-1-entscheide-dich"/>
+    <w:bookmarkEnd w:id="214"/>
+    <w:bookmarkStart w:id="215" w:name="aufgabe-1-entscheide-dich"/>
     <w:p>
       <w:pPr>
         <w:pStyle w:val="Heading2"/>
@@ -20227,8 +19919,8 @@
         </w:pict>
       </w:r>
     </w:p>
-    <w:bookmarkEnd w:id="221"/>
-    <w:bookmarkStart w:id="222" w:name="aufgabe-2-begründe-deine-entscheidung"/>
+    <w:bookmarkEnd w:id="215"/>
+    <w:bookmarkStart w:id="216" w:name="aufgabe-2-begründe-deine-entscheidung"/>
     <w:p>
       <w:pPr>
         <w:pStyle w:val="Heading2"/>
@@ -20302,8 +19994,8 @@
         </w:pict>
       </w:r>
     </w:p>
-    <w:bookmarkEnd w:id="222"/>
-    <w:bookmarkStart w:id="223" w:name="aufgabe-3-fehler-finden"/>
+    <w:bookmarkEnd w:id="216"/>
+    <w:bookmarkStart w:id="217" w:name="aufgabe-3-fehler-finden"/>
     <w:p>
       <w:pPr>
         <w:pStyle w:val="Heading2"/>
@@ -20458,8 +20150,8 @@
         </w:pict>
       </w:r>
     </w:p>
-    <w:bookmarkEnd w:id="223"/>
-    <w:bookmarkStart w:id="224" w:name="aufgabe-4-eigene-beispiele-1"/>
+    <w:bookmarkEnd w:id="217"/>
+    <w:bookmarkStart w:id="218" w:name="aufgabe-4-eigene-beispiele-1"/>
     <w:p>
       <w:pPr>
         <w:pStyle w:val="Heading2"/>
@@ -20634,8 +20326,8 @@
         </w:pict>
       </w:r>
     </w:p>
-    <w:bookmarkEnd w:id="224"/>
-    <w:bookmarkStart w:id="225" w:name="merkkasten-16"/>
+    <w:bookmarkEnd w:id="218"/>
+    <w:bookmarkStart w:id="219" w:name="merkkasten-16"/>
     <w:p>
       <w:pPr>
         <w:pStyle w:val="Heading2"/>
@@ -20691,8 +20383,8 @@
         </w:pict>
       </w:r>
     </w:p>
-    <w:bookmarkEnd w:id="225"/>
-    <w:bookmarkStart w:id="226" w:name="das-nehmen-wir-mit-21"/>
+    <w:bookmarkEnd w:id="219"/>
+    <w:bookmarkStart w:id="220" w:name="das-nehmen-wir-mit-21"/>
     <w:p>
       <w:pPr>
         <w:pStyle w:val="Heading2"/>
@@ -20730,9 +20422,9 @@
         <w:br w:type="page"/>
       </w:r>
     </w:p>
-    <w:bookmarkEnd w:id="226"/>
-    <w:bookmarkEnd w:id="227"/>
-    <w:bookmarkStart w:id="235" w:name="kapitel-5-informationen-auswerten"/>
+    <w:bookmarkEnd w:id="220"/>
+    <w:bookmarkEnd w:id="221"/>
+    <w:bookmarkStart w:id="229" w:name="kapitel-5-informationen-auswerten"/>
     <w:p>
       <w:pPr>
         <w:pStyle w:val="Heading1"/>
@@ -20741,7 +20433,7 @@
         <w:t xml:space="preserve">Kapitel 5 – Informationen auswerten</w:t>
       </w:r>
     </w:p>
-    <w:bookmarkStart w:id="228" w:name="einstieg-21"/>
+    <w:bookmarkStart w:id="222" w:name="einstieg-21"/>
     <w:p>
       <w:pPr>
         <w:pStyle w:val="Heading2"/>
@@ -20837,8 +20529,8 @@
         </w:pict>
       </w:r>
     </w:p>
-    <w:bookmarkEnd w:id="228"/>
-    <w:bookmarkStart w:id="229" w:name="aufgabe-1-was-fällt-auf"/>
+    <w:bookmarkEnd w:id="222"/>
+    <w:bookmarkStart w:id="223" w:name="aufgabe-1-was-fällt-auf"/>
     <w:p>
       <w:pPr>
         <w:pStyle w:val="Heading2"/>
@@ -21046,8 +20738,8 @@
         </w:pict>
       </w:r>
     </w:p>
-    <w:bookmarkEnd w:id="229"/>
-    <w:bookmarkStart w:id="230" w:name="aufgabe-2-entscheidungen-treffen"/>
+    <w:bookmarkEnd w:id="223"/>
+    <w:bookmarkStart w:id="224" w:name="aufgabe-2-entscheidungen-treffen"/>
     <w:p>
       <w:pPr>
         <w:pStyle w:val="Heading2"/>
@@ -21111,8 +20803,8 @@
         </w:pict>
       </w:r>
     </w:p>
-    <w:bookmarkEnd w:id="230"/>
-    <w:bookmarkStart w:id="231" w:name="aufgabe-3-welche-informationen-fehlen-1"/>
+    <w:bookmarkEnd w:id="224"/>
+    <w:bookmarkStart w:id="225" w:name="aufgabe-3-welche-informationen-fehlen-1"/>
     <w:p>
       <w:pPr>
         <w:pStyle w:val="Heading2"/>
@@ -21201,8 +20893,8 @@
         </w:pict>
       </w:r>
     </w:p>
-    <w:bookmarkEnd w:id="231"/>
-    <w:bookmarkStart w:id="232" w:name="aufgabe-4-daten-oder-information"/>
+    <w:bookmarkEnd w:id="225"/>
+    <w:bookmarkStart w:id="226" w:name="aufgabe-4-daten-oder-information"/>
     <w:p>
       <w:pPr>
         <w:pStyle w:val="Heading2"/>
@@ -21440,8 +21132,8 @@
         </w:pict>
       </w:r>
     </w:p>
-    <w:bookmarkEnd w:id="232"/>
-    <w:bookmarkStart w:id="233" w:name="merkkasten-17"/>
+    <w:bookmarkEnd w:id="226"/>
+    <w:bookmarkStart w:id="227" w:name="merkkasten-17"/>
     <w:p>
       <w:pPr>
         <w:pStyle w:val="Heading2"/>
@@ -21486,8 +21178,8 @@
         </w:pict>
       </w:r>
     </w:p>
-    <w:bookmarkEnd w:id="233"/>
-    <w:bookmarkStart w:id="234" w:name="das-nehmen-wir-mit-22"/>
+    <w:bookmarkEnd w:id="227"/>
+    <w:bookmarkStart w:id="228" w:name="das-nehmen-wir-mit-22"/>
     <w:p>
       <w:pPr>
         <w:pStyle w:val="Heading2"/>
@@ -21533,9 +21225,9 @@
         <w:br w:type="page"/>
       </w:r>
     </w:p>
-    <w:bookmarkEnd w:id="234"/>
-    <w:bookmarkEnd w:id="235"/>
-    <w:bookmarkStart w:id="243" w:name="kapitel-5-informationen-darstellen"/>
+    <w:bookmarkEnd w:id="228"/>
+    <w:bookmarkEnd w:id="229"/>
+    <w:bookmarkStart w:id="237" w:name="kapitel-5-informationen-darstellen"/>
     <w:p>
       <w:pPr>
         <w:pStyle w:val="Heading1"/>
@@ -21544,7 +21236,7 @@
         <w:t xml:space="preserve">Kapitel 5 – Informationen darstellen</w:t>
       </w:r>
     </w:p>
-    <w:bookmarkStart w:id="236" w:name="einstieg-22"/>
+    <w:bookmarkStart w:id="230" w:name="einstieg-22"/>
     <w:p>
       <w:pPr>
         <w:pStyle w:val="Heading2"/>
@@ -21719,8 +21411,8 @@
         </w:pict>
       </w:r>
     </w:p>
-    <w:bookmarkEnd w:id="236"/>
-    <w:bookmarkStart w:id="237" w:name="aufgabe-1-vergleichen"/>
+    <w:bookmarkEnd w:id="230"/>
+    <w:bookmarkStart w:id="231" w:name="aufgabe-1-vergleichen"/>
     <w:p>
       <w:pPr>
         <w:pStyle w:val="Heading2"/>
@@ -21809,8 +21501,8 @@
         </w:pict>
       </w:r>
     </w:p>
-    <w:bookmarkEnd w:id="237"/>
-    <w:bookmarkStart w:id="238" w:name="X2bc94d3386128b5edbc5d19cb7991b51a09847d"/>
+    <w:bookmarkEnd w:id="231"/>
+    <w:bookmarkStart w:id="232" w:name="X2bc94d3386128b5edbc5d19cb7991b51a09847d"/>
     <w:p>
       <w:pPr>
         <w:pStyle w:val="Heading2"/>
@@ -21896,8 +21588,8 @@
         </w:pict>
       </w:r>
     </w:p>
-    <w:bookmarkEnd w:id="238"/>
-    <w:bookmarkStart w:id="239" w:name="aufgabe-3-vor--und-nachteile"/>
+    <w:bookmarkEnd w:id="232"/>
+    <w:bookmarkStart w:id="233" w:name="aufgabe-3-vor--und-nachteile"/>
     <w:p>
       <w:pPr>
         <w:pStyle w:val="Heading2"/>
@@ -22046,8 +21738,8 @@
         </w:pict>
       </w:r>
     </w:p>
-    <w:bookmarkEnd w:id="239"/>
-    <w:bookmarkStart w:id="240" w:name="aufgabe-4-entscheidungen-treffen"/>
+    <w:bookmarkEnd w:id="233"/>
+    <w:bookmarkStart w:id="234" w:name="aufgabe-4-entscheidungen-treffen"/>
     <w:p>
       <w:pPr>
         <w:pStyle w:val="Heading2"/>
@@ -22108,8 +21800,8 @@
         </w:pict>
       </w:r>
     </w:p>
-    <w:bookmarkEnd w:id="240"/>
-    <w:bookmarkStart w:id="241" w:name="merkkasten-18"/>
+    <w:bookmarkEnd w:id="234"/>
+    <w:bookmarkStart w:id="235" w:name="merkkasten-18"/>
     <w:p>
       <w:pPr>
         <w:pStyle w:val="Heading2"/>
@@ -22165,8 +21857,8 @@
         </w:pict>
       </w:r>
     </w:p>
-    <w:bookmarkEnd w:id="241"/>
-    <w:bookmarkStart w:id="242" w:name="das-nehmen-wir-mit-23"/>
+    <w:bookmarkEnd w:id="235"/>
+    <w:bookmarkStart w:id="236" w:name="das-nehmen-wir-mit-23"/>
     <w:p>
       <w:pPr>
         <w:pStyle w:val="Heading2"/>
@@ -22220,9 +21912,9 @@
         <w:br w:type="page"/>
       </w:r>
     </w:p>
-    <w:bookmarkEnd w:id="242"/>
-    <w:bookmarkEnd w:id="243"/>
-    <w:bookmarkStart w:id="253" w:name="kapitel-5-das-passende-diagramm"/>
+    <w:bookmarkEnd w:id="236"/>
+    <w:bookmarkEnd w:id="237"/>
+    <w:bookmarkStart w:id="247" w:name="kapitel-5-das-passende-diagramm"/>
     <w:p>
       <w:pPr>
         <w:pStyle w:val="Heading1"/>
@@ -22231,7 +21923,7 @@
         <w:t xml:space="preserve">Kapitel 5 – Das passende Diagramm</w:t>
       </w:r>
     </w:p>
-    <w:bookmarkStart w:id="244" w:name="einstieg-23"/>
+    <w:bookmarkStart w:id="238" w:name="einstieg-23"/>
     <w:p>
       <w:pPr>
         <w:pStyle w:val="Heading2"/>
@@ -22271,8 +21963,8 @@
         </w:pict>
       </w:r>
     </w:p>
-    <w:bookmarkEnd w:id="244"/>
-    <w:bookmarkStart w:id="245" w:name="X7f3198a20321090cc42cb10311fb27f7119d41a"/>
+    <w:bookmarkEnd w:id="238"/>
+    <w:bookmarkStart w:id="239" w:name="X7f3198a20321090cc42cb10311fb27f7119d41a"/>
     <w:p>
       <w:pPr>
         <w:pStyle w:val="Heading2"/>
@@ -22613,8 +22305,8 @@
         </w:pict>
       </w:r>
     </w:p>
-    <w:bookmarkEnd w:id="245"/>
-    <w:bookmarkStart w:id="246" w:name="aufgabe-2-begründet-eure-entscheidung-1"/>
+    <w:bookmarkEnd w:id="239"/>
+    <w:bookmarkStart w:id="240" w:name="aufgabe-2-begründet-eure-entscheidung-1"/>
     <w:p>
       <w:pPr>
         <w:pStyle w:val="Heading2"/>
@@ -22674,8 +22366,8 @@
         </w:pict>
       </w:r>
     </w:p>
-    <w:bookmarkEnd w:id="246"/>
-    <w:bookmarkStart w:id="249" w:name="aufgabe-3-welches-diagramm-passt-nicht"/>
+    <w:bookmarkEnd w:id="240"/>
+    <w:bookmarkStart w:id="243" w:name="aufgabe-3-welches-diagramm-passt-nicht"/>
     <w:p>
       <w:pPr>
         <w:pStyle w:val="Heading2"/>
@@ -22692,7 +22384,7 @@
         <w:t xml:space="preserve">Kreuzt an und begründet.</w:t>
       </w:r>
     </w:p>
-    <w:bookmarkStart w:id="247" w:name="a"/>
+    <w:bookmarkStart w:id="241" w:name="a"/>
     <w:p>
       <w:pPr>
         <w:pStyle w:val="Heading3"/>
@@ -22755,8 +22447,8 @@
         </w:pict>
       </w:r>
     </w:p>
-    <w:bookmarkEnd w:id="247"/>
-    <w:bookmarkStart w:id="248" w:name="b"/>
+    <w:bookmarkEnd w:id="241"/>
+    <w:bookmarkStart w:id="242" w:name="b"/>
     <w:p>
       <w:pPr>
         <w:pStyle w:val="Heading3"/>
@@ -22819,9 +22511,9 @@
         </w:pict>
       </w:r>
     </w:p>
-    <w:bookmarkEnd w:id="248"/>
-    <w:bookmarkEnd w:id="249"/>
-    <w:bookmarkStart w:id="250" w:name="aufgabe-4-eigene-entscheidung"/>
+    <w:bookmarkEnd w:id="242"/>
+    <w:bookmarkEnd w:id="243"/>
+    <w:bookmarkStart w:id="244" w:name="aufgabe-4-eigene-entscheidung"/>
     <w:p>
       <w:pPr>
         <w:pStyle w:val="Heading2"/>
@@ -22949,8 +22641,8 @@
         </w:pict>
       </w:r>
     </w:p>
-    <w:bookmarkEnd w:id="250"/>
-    <w:bookmarkStart w:id="251" w:name="merkkasten-19"/>
+    <w:bookmarkEnd w:id="244"/>
+    <w:bookmarkStart w:id="245" w:name="merkkasten-19"/>
     <w:p>
       <w:pPr>
         <w:pStyle w:val="Heading2"/>
@@ -23040,8 +22732,8 @@
         </w:pict>
       </w:r>
     </w:p>
-    <w:bookmarkEnd w:id="251"/>
-    <w:bookmarkStart w:id="252" w:name="das-nehmen-wir-mit-24"/>
+    <w:bookmarkEnd w:id="245"/>
+    <w:bookmarkStart w:id="246" w:name="das-nehmen-wir-mit-24"/>
     <w:p>
       <w:pPr>
         <w:pStyle w:val="Heading2"/>
@@ -23079,9 +22771,9 @@
         <w:br w:type="page"/>
       </w:r>
     </w:p>
-    <w:bookmarkEnd w:id="252"/>
-    <w:bookmarkEnd w:id="253"/>
-    <w:bookmarkStart w:id="261" w:name="Xb0531ecbaa9a34a288d1c51d777ac91c93db753"/>
+    <w:bookmarkEnd w:id="246"/>
+    <w:bookmarkEnd w:id="247"/>
+    <w:bookmarkStart w:id="255" w:name="Xb0531ecbaa9a34a288d1c51d777ac91c93db753"/>
     <w:p>
       <w:pPr>
         <w:pStyle w:val="Heading1"/>
@@ -23090,7 +22782,7 @@
         <w:t xml:space="preserve">Kapitel 6 – Wenn Datenmengen zu groß werden</w:t>
       </w:r>
     </w:p>
-    <w:bookmarkStart w:id="254" w:name="einstieg-24"/>
+    <w:bookmarkStart w:id="248" w:name="einstieg-24"/>
     <w:p>
       <w:pPr>
         <w:pStyle w:val="Heading2"/>
@@ -23194,8 +22886,8 @@
         </w:pict>
       </w:r>
     </w:p>
-    <w:bookmarkEnd w:id="254"/>
-    <w:bookmarkStart w:id="255" w:name="aufgabe-1-kleine-oder-große-datenmenge"/>
+    <w:bookmarkEnd w:id="248"/>
+    <w:bookmarkStart w:id="249" w:name="aufgabe-1-kleine-oder-große-datenmenge"/>
     <w:p>
       <w:pPr>
         <w:pStyle w:val="Heading2"/>
@@ -23501,8 +23193,8 @@
         </w:pict>
       </w:r>
     </w:p>
-    <w:bookmarkEnd w:id="255"/>
-    <w:bookmarkStart w:id="256" w:name="aufgabe-2-warum-wird-es-schwierig"/>
+    <w:bookmarkEnd w:id="249"/>
+    <w:bookmarkStart w:id="250" w:name="aufgabe-2-warum-wird-es-schwierig"/>
     <w:p>
       <w:pPr>
         <w:pStyle w:val="Heading2"/>
@@ -23574,8 +23266,8 @@
         </w:pict>
       </w:r>
     </w:p>
-    <w:bookmarkEnd w:id="256"/>
-    <w:bookmarkStart w:id="257" w:name="aufgabe-3-wo-entstehen-große-datenmengen"/>
+    <w:bookmarkEnd w:id="250"/>
+    <w:bookmarkStart w:id="251" w:name="aufgabe-3-wo-entstehen-große-datenmengen"/>
     <w:p>
       <w:pPr>
         <w:pStyle w:val="Heading2"/>
@@ -23620,8 +23312,8 @@
         </w:pict>
       </w:r>
     </w:p>
-    <w:bookmarkEnd w:id="257"/>
-    <w:bookmarkStart w:id="258" w:name="aufgabe-4-nachdenken-3"/>
+    <w:bookmarkEnd w:id="251"/>
+    <w:bookmarkStart w:id="252" w:name="aufgabe-4-nachdenken-3"/>
     <w:p>
       <w:pPr>
         <w:pStyle w:val="Heading2"/>
@@ -23681,8 +23373,8 @@
         </w:pict>
       </w:r>
     </w:p>
-    <w:bookmarkEnd w:id="258"/>
-    <w:bookmarkStart w:id="259" w:name="merkkasten-20"/>
+    <w:bookmarkEnd w:id="252"/>
+    <w:bookmarkStart w:id="253" w:name="merkkasten-20"/>
     <w:p>
       <w:pPr>
         <w:pStyle w:val="Heading2"/>
@@ -23746,8 +23438,8 @@
         </w:pict>
       </w:r>
     </w:p>
-    <w:bookmarkEnd w:id="259"/>
-    <w:bookmarkStart w:id="260" w:name="das-nehmen-wir-mit-25"/>
+    <w:bookmarkEnd w:id="253"/>
+    <w:bookmarkStart w:id="254" w:name="das-nehmen-wir-mit-25"/>
     <w:p>
       <w:pPr>
         <w:pStyle w:val="Heading2"/>
@@ -23793,9 +23485,9 @@
         <w:br w:type="page"/>
       </w:r>
     </w:p>
-    <w:bookmarkEnd w:id="260"/>
-    <w:bookmarkEnd w:id="261"/>
-    <w:bookmarkStart w:id="269" w:name="kapitel-6-muster-erkennen"/>
+    <w:bookmarkEnd w:id="254"/>
+    <w:bookmarkEnd w:id="255"/>
+    <w:bookmarkStart w:id="263" w:name="kapitel-6-muster-erkennen"/>
     <w:p>
       <w:pPr>
         <w:pStyle w:val="Heading1"/>
@@ -23804,7 +23496,7 @@
         <w:t xml:space="preserve">Kapitel 6 – Muster erkennen</w:t>
       </w:r>
     </w:p>
-    <w:bookmarkStart w:id="262" w:name="einstieg-25"/>
+    <w:bookmarkStart w:id="256" w:name="einstieg-25"/>
     <w:p>
       <w:pPr>
         <w:pStyle w:val="Heading2"/>
@@ -23920,8 +23612,8 @@
         </w:pict>
       </w:r>
     </w:p>
-    <w:bookmarkEnd w:id="262"/>
-    <w:bookmarkStart w:id="263" w:name="aufgabe-1-was-fällt-euch-auf"/>
+    <w:bookmarkEnd w:id="256"/>
+    <w:bookmarkStart w:id="257" w:name="aufgabe-1-was-fällt-euch-auf"/>
     <w:p>
       <w:pPr>
         <w:pStyle w:val="Heading2"/>
@@ -24327,316 +24019,316 @@
         </w:pict>
       </w:r>
     </w:p>
+    <w:bookmarkEnd w:id="257"/>
+    <w:bookmarkStart w:id="258" w:name="aufgabe-2-vermutungen-aufstellen"/>
+    <w:p>
+      <w:pPr>
+        <w:pStyle w:val="Heading2"/>
+      </w:pPr>
+      <w:r>
+        <w:t xml:space="preserve">Aufgabe 2 – Vermutungen aufstellen</w:t>
+      </w:r>
+    </w:p>
+    <w:p>
+      <w:pPr>
+        <w:pStyle w:val="FirstParagraph"/>
+      </w:pPr>
+      <w:r>
+        <w:t xml:space="preserve">Welche Aussagen könnten richtig sein?</w:t>
+      </w:r>
+    </w:p>
+    <w:p>
+      <w:pPr>
+        <w:pStyle w:val="BodyText"/>
+      </w:pPr>
+      <w:r>
+        <w:t xml:space="preserve">Kreuzt an.</w:t>
+      </w:r>
+    </w:p>
+    <w:p>
+      <w:pPr>
+        <w:pStyle w:val="BodyText"/>
+      </w:pPr>
+      <w:r>
+        <w:t xml:space="preserve">□ Bei gutem Wetter kommen mehr Besucher.</w:t>
+      </w:r>
+    </w:p>
+    <w:p>
+      <w:pPr>
+        <w:pStyle w:val="BodyText"/>
+      </w:pPr>
+      <w:r>
+        <w:t xml:space="preserve">□ Je mehr Besucher kommen, desto mehr Getränke werden verkauft.</w:t>
+      </w:r>
+    </w:p>
+    <w:p>
+      <w:pPr>
+        <w:pStyle w:val="BodyText"/>
+      </w:pPr>
+      <w:r>
+        <w:t xml:space="preserve">□ Das Wetter hat keinen Einfluss.</w:t>
+      </w:r>
+    </w:p>
+    <w:p>
+      <w:pPr>
+        <w:pStyle w:val="BodyText"/>
+      </w:pPr>
+      <w:r>
+        <w:t xml:space="preserve">□ ________________________________________</w:t>
+      </w:r>
+    </w:p>
+    <w:p>
+      <w:pPr>
+        <w:pStyle w:val="BodyText"/>
+      </w:pPr>
+      <w:r>
+        <w:t xml:space="preserve">Begründet eure Entscheidung.</w:t>
+      </w:r>
+    </w:p>
+    <w:p>
+      <w:r>
+        <w:pict>
+          <v:rect style="width:0;height:1.5pt" o:hralign="center" o:hrstd="t" o:hr="t"/>
+        </w:pict>
+      </w:r>
+    </w:p>
+    <w:p>
+      <w:r>
+        <w:pict>
+          <v:rect style="width:0;height:1.5pt" o:hralign="center" o:hrstd="t" o:hr="t"/>
+        </w:pict>
+      </w:r>
+    </w:p>
+    <w:p>
+      <w:r>
+        <w:pict>
+          <v:rect style="width:0;height:1.5pt" o:hralign="center" o:hrstd="t" o:hr="t"/>
+        </w:pict>
+      </w:r>
+    </w:p>
+    <w:bookmarkEnd w:id="258"/>
+    <w:bookmarkStart w:id="259" w:name="aufgabe-3-reichen-fünf-jahre-aus"/>
+    <w:p>
+      <w:pPr>
+        <w:pStyle w:val="Heading2"/>
+      </w:pPr>
+      <w:r>
+        <w:t xml:space="preserve">Aufgabe 3 – Reichen fünf Jahre aus?</w:t>
+      </w:r>
+    </w:p>
+    <w:p>
+      <w:pPr>
+        <w:pStyle w:val="FirstParagraph"/>
+      </w:pPr>
+      <w:r>
+        <w:t xml:space="preserve">Diskutiert.</w:t>
+      </w:r>
+    </w:p>
+    <w:p>
+      <w:pPr>
+        <w:pStyle w:val="BodyText"/>
+      </w:pPr>
+      <w:r>
+        <w:t xml:space="preserve">Warum sind Vermutungen zuverlässiger,</w:t>
+      </w:r>
+    </w:p>
+    <w:p>
+      <w:pPr>
+        <w:pStyle w:val="BodyText"/>
+      </w:pPr>
+      <w:r>
+        <w:t xml:space="preserve">wenn viele Daten ausgewertet werden?</w:t>
+      </w:r>
+    </w:p>
+    <w:p>
+      <w:r>
+        <w:pict>
+          <v:rect style="width:0;height:1.5pt" o:hralign="center" o:hrstd="t" o:hr="t"/>
+        </w:pict>
+      </w:r>
+    </w:p>
+    <w:p>
+      <w:r>
+        <w:pict>
+          <v:rect style="width:0;height:1.5pt" o:hralign="center" o:hrstd="t" o:hr="t"/>
+        </w:pict>
+      </w:r>
+    </w:p>
+    <w:p>
+      <w:r>
+        <w:pict>
+          <v:rect style="width:0;height:1.5pt" o:hralign="center" o:hrstd="t" o:hr="t"/>
+        </w:pict>
+      </w:r>
+    </w:p>
+    <w:p>
+      <w:r>
+        <w:pict>
+          <v:rect style="width:0;height:1.5pt" o:hralign="center" o:hrstd="t" o:hr="t"/>
+        </w:pict>
+      </w:r>
+    </w:p>
+    <w:bookmarkEnd w:id="259"/>
+    <w:bookmarkStart w:id="260" w:name="aufgabe-4-beispiele-aus-dem-alltag"/>
+    <w:p>
+      <w:pPr>
+        <w:pStyle w:val="Heading2"/>
+      </w:pPr>
+      <w:r>
+        <w:t xml:space="preserve">Aufgabe 4 – Beispiele aus dem Alltag</w:t>
+      </w:r>
+    </w:p>
+    <w:p>
+      <w:pPr>
+        <w:pStyle w:val="FirstParagraph"/>
+      </w:pPr>
+      <w:r>
+        <w:t xml:space="preserve">Wo werden Zusammenhänge in großen Datenmengen gesucht?</w:t>
+      </w:r>
+    </w:p>
+    <w:p>
+      <w:pPr>
+        <w:pStyle w:val="BodyText"/>
+      </w:pPr>
+      <w:r>
+        <w:t xml:space="preserve">Nennt Beispiele.</w:t>
+      </w:r>
+    </w:p>
+    <w:p>
+      <w:r>
+        <w:pict>
+          <v:rect style="width:0;height:1.5pt" o:hralign="center" o:hrstd="t" o:hr="t"/>
+        </w:pict>
+      </w:r>
+    </w:p>
+    <w:p>
+      <w:r>
+        <w:pict>
+          <v:rect style="width:0;height:1.5pt" o:hralign="center" o:hrstd="t" o:hr="t"/>
+        </w:pict>
+      </w:r>
+    </w:p>
+    <w:p>
+      <w:r>
+        <w:pict>
+          <v:rect style="width:0;height:1.5pt" o:hralign="center" o:hrstd="t" o:hr="t"/>
+        </w:pict>
+      </w:r>
+    </w:p>
+    <w:p>
+      <w:r>
+        <w:pict>
+          <v:rect style="width:0;height:1.5pt" o:hralign="center" o:hrstd="t" o:hr="t"/>
+        </w:pict>
+      </w:r>
+    </w:p>
+    <w:bookmarkEnd w:id="260"/>
+    <w:bookmarkStart w:id="261" w:name="merkkasten-21"/>
+    <w:p>
+      <w:pPr>
+        <w:pStyle w:val="Heading2"/>
+      </w:pPr>
+      <w:r>
+        <w:t xml:space="preserve">Merkkasten</w:t>
+      </w:r>
+    </w:p>
+    <w:p>
+      <w:pPr>
+        <w:pStyle w:val="FirstParagraph"/>
+      </w:pPr>
+      <w:r>
+        <w:t xml:space="preserve">Beim Auswerten großer Datenmengen können Muster und Zusammenhänge erkannt werden.</w:t>
+      </w:r>
+    </w:p>
+    <w:p>
+      <w:pPr>
+        <w:pStyle w:val="BodyText"/>
+      </w:pPr>
+      <w:r>
+        <w:t xml:space="preserve">Solche Muster helfen dabei,</w:t>
+      </w:r>
+    </w:p>
+    <w:p>
+      <w:pPr>
+        <w:pStyle w:val="BodyText"/>
+      </w:pPr>
+      <w:r>
+        <w:t xml:space="preserve">Vorhersagen zu treffen oder Entscheidungen zu unterstützen.</w:t>
+      </w:r>
+    </w:p>
+    <w:p>
+      <w:pPr>
+        <w:pStyle w:val="BodyText"/>
+      </w:pPr>
+      <w:r>
+        <w:t xml:space="preserve">Einzelne Daten sind dabei weniger wichtig als die Gesamtheit vieler Daten.</w:t>
+      </w:r>
+    </w:p>
+    <w:p>
+      <w:r>
+        <w:pict>
+          <v:rect style="width:0;height:1.5pt" o:hralign="center" o:hrstd="t" o:hr="t"/>
+        </w:pict>
+      </w:r>
+    </w:p>
+    <w:bookmarkEnd w:id="261"/>
+    <w:bookmarkStart w:id="262" w:name="das-nehmen-wir-mit-26"/>
+    <w:p>
+      <w:pPr>
+        <w:pStyle w:val="Heading2"/>
+      </w:pPr>
+      <w:r>
+        <w:t xml:space="preserve">Das nehmen wir mit</w:t>
+      </w:r>
+    </w:p>
+    <w:p>
+      <w:pPr>
+        <w:pStyle w:val="FirstParagraph"/>
+      </w:pPr>
+      <w:r>
+        <w:t xml:space="preserve">Je mehr Daten vorliegen,</w:t>
+      </w:r>
+    </w:p>
+    <w:p>
+      <w:pPr>
+        <w:pStyle w:val="BodyText"/>
+      </w:pPr>
+      <w:r>
+        <w:t xml:space="preserve">desto leichter lassen sich Zusammenhänge erkennen.</w:t>
+      </w:r>
+    </w:p>
+    <w:p>
+      <w:pPr>
+        <w:pStyle w:val="BodyText"/>
+      </w:pPr>
+      <w:r>
+        <w:t xml:space="preserve">Computer können Menschen dabei unterstützen,</w:t>
+      </w:r>
+    </w:p>
+    <w:p>
+      <w:pPr>
+        <w:pStyle w:val="BodyText"/>
+      </w:pPr>
+      <w:r>
+        <w:t xml:space="preserve">solche Muster schneller zu finden.</w:t>
+      </w:r>
+    </w:p>
+    <w:p>
+      <w:pPr>
+        <w:pStyle w:val="BodyText"/>
+      </w:pPr>
+      <w:r>
+        <w:t xml:space="preserve">Im nächsten Abschnitt lernen wir kennen, wie Künstliche Intelligenz solche Muster nutzt.</w:t>
+      </w:r>
+    </w:p>
+    <w:p>
+      <w:r>
+        <w:br w:type="page"/>
+      </w:r>
+    </w:p>
+    <w:bookmarkEnd w:id="262"/>
     <w:bookmarkEnd w:id="263"/>
-    <w:bookmarkStart w:id="264" w:name="aufgabe-2-vermutungen-aufstellen"/>
-    <w:p>
-      <w:pPr>
-        <w:pStyle w:val="Heading2"/>
-      </w:pPr>
-      <w:r>
-        <w:t xml:space="preserve">Aufgabe 2 – Vermutungen aufstellen</w:t>
-      </w:r>
-    </w:p>
-    <w:p>
-      <w:pPr>
-        <w:pStyle w:val="FirstParagraph"/>
-      </w:pPr>
-      <w:r>
-        <w:t xml:space="preserve">Welche Aussagen könnten richtig sein?</w:t>
-      </w:r>
-    </w:p>
-    <w:p>
-      <w:pPr>
-        <w:pStyle w:val="BodyText"/>
-      </w:pPr>
-      <w:r>
-        <w:t xml:space="preserve">Kreuzt an.</w:t>
-      </w:r>
-    </w:p>
-    <w:p>
-      <w:pPr>
-        <w:pStyle w:val="BodyText"/>
-      </w:pPr>
-      <w:r>
-        <w:t xml:space="preserve">□ Bei gutem Wetter kommen mehr Besucher.</w:t>
-      </w:r>
-    </w:p>
-    <w:p>
-      <w:pPr>
-        <w:pStyle w:val="BodyText"/>
-      </w:pPr>
-      <w:r>
-        <w:t xml:space="preserve">□ Je mehr Besucher kommen, desto mehr Getränke werden verkauft.</w:t>
-      </w:r>
-    </w:p>
-    <w:p>
-      <w:pPr>
-        <w:pStyle w:val="BodyText"/>
-      </w:pPr>
-      <w:r>
-        <w:t xml:space="preserve">□ Das Wetter hat keinen Einfluss.</w:t>
-      </w:r>
-    </w:p>
-    <w:p>
-      <w:pPr>
-        <w:pStyle w:val="BodyText"/>
-      </w:pPr>
-      <w:r>
-        <w:t xml:space="preserve">□ ________________________________________</w:t>
-      </w:r>
-    </w:p>
-    <w:p>
-      <w:pPr>
-        <w:pStyle w:val="BodyText"/>
-      </w:pPr>
-      <w:r>
-        <w:t xml:space="preserve">Begründet eure Entscheidung.</w:t>
-      </w:r>
-    </w:p>
-    <w:p>
-      <w:r>
-        <w:pict>
-          <v:rect style="width:0;height:1.5pt" o:hralign="center" o:hrstd="t" o:hr="t"/>
-        </w:pict>
-      </w:r>
-    </w:p>
-    <w:p>
-      <w:r>
-        <w:pict>
-          <v:rect style="width:0;height:1.5pt" o:hralign="center" o:hrstd="t" o:hr="t"/>
-        </w:pict>
-      </w:r>
-    </w:p>
-    <w:p>
-      <w:r>
-        <w:pict>
-          <v:rect style="width:0;height:1.5pt" o:hralign="center" o:hrstd="t" o:hr="t"/>
-        </w:pict>
-      </w:r>
-    </w:p>
-    <w:bookmarkEnd w:id="264"/>
-    <w:bookmarkStart w:id="265" w:name="aufgabe-3-reichen-fünf-jahre-aus"/>
-    <w:p>
-      <w:pPr>
-        <w:pStyle w:val="Heading2"/>
-      </w:pPr>
-      <w:r>
-        <w:t xml:space="preserve">Aufgabe 3 – Reichen fünf Jahre aus?</w:t>
-      </w:r>
-    </w:p>
-    <w:p>
-      <w:pPr>
-        <w:pStyle w:val="FirstParagraph"/>
-      </w:pPr>
-      <w:r>
-        <w:t xml:space="preserve">Diskutiert.</w:t>
-      </w:r>
-    </w:p>
-    <w:p>
-      <w:pPr>
-        <w:pStyle w:val="BodyText"/>
-      </w:pPr>
-      <w:r>
-        <w:t xml:space="preserve">Warum sind Vermutungen zuverlässiger,</w:t>
-      </w:r>
-    </w:p>
-    <w:p>
-      <w:pPr>
-        <w:pStyle w:val="BodyText"/>
-      </w:pPr>
-      <w:r>
-        <w:t xml:space="preserve">wenn viele Daten ausgewertet werden?</w:t>
-      </w:r>
-    </w:p>
-    <w:p>
-      <w:r>
-        <w:pict>
-          <v:rect style="width:0;height:1.5pt" o:hralign="center" o:hrstd="t" o:hr="t"/>
-        </w:pict>
-      </w:r>
-    </w:p>
-    <w:p>
-      <w:r>
-        <w:pict>
-          <v:rect style="width:0;height:1.5pt" o:hralign="center" o:hrstd="t" o:hr="t"/>
-        </w:pict>
-      </w:r>
-    </w:p>
-    <w:p>
-      <w:r>
-        <w:pict>
-          <v:rect style="width:0;height:1.5pt" o:hralign="center" o:hrstd="t" o:hr="t"/>
-        </w:pict>
-      </w:r>
-    </w:p>
-    <w:p>
-      <w:r>
-        <w:pict>
-          <v:rect style="width:0;height:1.5pt" o:hralign="center" o:hrstd="t" o:hr="t"/>
-        </w:pict>
-      </w:r>
-    </w:p>
-    <w:bookmarkEnd w:id="265"/>
-    <w:bookmarkStart w:id="266" w:name="aufgabe-4-beispiele-aus-dem-alltag"/>
-    <w:p>
-      <w:pPr>
-        <w:pStyle w:val="Heading2"/>
-      </w:pPr>
-      <w:r>
-        <w:t xml:space="preserve">Aufgabe 4 – Beispiele aus dem Alltag</w:t>
-      </w:r>
-    </w:p>
-    <w:p>
-      <w:pPr>
-        <w:pStyle w:val="FirstParagraph"/>
-      </w:pPr>
-      <w:r>
-        <w:t xml:space="preserve">Wo werden Zusammenhänge in großen Datenmengen gesucht?</w:t>
-      </w:r>
-    </w:p>
-    <w:p>
-      <w:pPr>
-        <w:pStyle w:val="BodyText"/>
-      </w:pPr>
-      <w:r>
-        <w:t xml:space="preserve">Nennt Beispiele.</w:t>
-      </w:r>
-    </w:p>
-    <w:p>
-      <w:r>
-        <w:pict>
-          <v:rect style="width:0;height:1.5pt" o:hralign="center" o:hrstd="t" o:hr="t"/>
-        </w:pict>
-      </w:r>
-    </w:p>
-    <w:p>
-      <w:r>
-        <w:pict>
-          <v:rect style="width:0;height:1.5pt" o:hralign="center" o:hrstd="t" o:hr="t"/>
-        </w:pict>
-      </w:r>
-    </w:p>
-    <w:p>
-      <w:r>
-        <w:pict>
-          <v:rect style="width:0;height:1.5pt" o:hralign="center" o:hrstd="t" o:hr="t"/>
-        </w:pict>
-      </w:r>
-    </w:p>
-    <w:p>
-      <w:r>
-        <w:pict>
-          <v:rect style="width:0;height:1.5pt" o:hralign="center" o:hrstd="t" o:hr="t"/>
-        </w:pict>
-      </w:r>
-    </w:p>
-    <w:bookmarkEnd w:id="266"/>
-    <w:bookmarkStart w:id="267" w:name="merkkasten-21"/>
-    <w:p>
-      <w:pPr>
-        <w:pStyle w:val="Heading2"/>
-      </w:pPr>
-      <w:r>
-        <w:t xml:space="preserve">Merkkasten</w:t>
-      </w:r>
-    </w:p>
-    <w:p>
-      <w:pPr>
-        <w:pStyle w:val="FirstParagraph"/>
-      </w:pPr>
-      <w:r>
-        <w:t xml:space="preserve">Beim Auswerten großer Datenmengen können Muster und Zusammenhänge erkannt werden.</w:t>
-      </w:r>
-    </w:p>
-    <w:p>
-      <w:pPr>
-        <w:pStyle w:val="BodyText"/>
-      </w:pPr>
-      <w:r>
-        <w:t xml:space="preserve">Solche Muster helfen dabei,</w:t>
-      </w:r>
-    </w:p>
-    <w:p>
-      <w:pPr>
-        <w:pStyle w:val="BodyText"/>
-      </w:pPr>
-      <w:r>
-        <w:t xml:space="preserve">Vorhersagen zu treffen oder Entscheidungen zu unterstützen.</w:t>
-      </w:r>
-    </w:p>
-    <w:p>
-      <w:pPr>
-        <w:pStyle w:val="BodyText"/>
-      </w:pPr>
-      <w:r>
-        <w:t xml:space="preserve">Einzelne Daten sind dabei weniger wichtig als die Gesamtheit vieler Daten.</w:t>
-      </w:r>
-    </w:p>
-    <w:p>
-      <w:r>
-        <w:pict>
-          <v:rect style="width:0;height:1.5pt" o:hralign="center" o:hrstd="t" o:hr="t"/>
-        </w:pict>
-      </w:r>
-    </w:p>
-    <w:bookmarkEnd w:id="267"/>
-    <w:bookmarkStart w:id="268" w:name="das-nehmen-wir-mit-26"/>
-    <w:p>
-      <w:pPr>
-        <w:pStyle w:val="Heading2"/>
-      </w:pPr>
-      <w:r>
-        <w:t xml:space="preserve">Das nehmen wir mit</w:t>
-      </w:r>
-    </w:p>
-    <w:p>
-      <w:pPr>
-        <w:pStyle w:val="FirstParagraph"/>
-      </w:pPr>
-      <w:r>
-        <w:t xml:space="preserve">Je mehr Daten vorliegen,</w:t>
-      </w:r>
-    </w:p>
-    <w:p>
-      <w:pPr>
-        <w:pStyle w:val="BodyText"/>
-      </w:pPr>
-      <w:r>
-        <w:t xml:space="preserve">desto leichter lassen sich Zusammenhänge erkennen.</w:t>
-      </w:r>
-    </w:p>
-    <w:p>
-      <w:pPr>
-        <w:pStyle w:val="BodyText"/>
-      </w:pPr>
-      <w:r>
-        <w:t xml:space="preserve">Computer können Menschen dabei unterstützen,</w:t>
-      </w:r>
-    </w:p>
-    <w:p>
-      <w:pPr>
-        <w:pStyle w:val="BodyText"/>
-      </w:pPr>
-      <w:r>
-        <w:t xml:space="preserve">solche Muster schneller zu finden.</w:t>
-      </w:r>
-    </w:p>
-    <w:p>
-      <w:pPr>
-        <w:pStyle w:val="BodyText"/>
-      </w:pPr>
-      <w:r>
-        <w:t xml:space="preserve">Im nächsten Abschnitt lernen wir kennen, wie Künstliche Intelligenz solche Muster nutzt.</w:t>
-      </w:r>
-    </w:p>
-    <w:p>
-      <w:r>
-        <w:br w:type="page"/>
-      </w:r>
-    </w:p>
-    <w:bookmarkEnd w:id="268"/>
-    <w:bookmarkEnd w:id="269"/>
-    <w:bookmarkStart w:id="278" w:name="kapitel-6-wie-ki-aus-daten-lernt"/>
+    <w:bookmarkStart w:id="272" w:name="kapitel-6-wie-ki-aus-daten-lernt"/>
     <w:p>
       <w:pPr>
         <w:pStyle w:val="Heading1"/>
@@ -24645,7 +24337,7 @@
         <w:t xml:space="preserve">Kapitel 6 – Wie KI aus Daten lernt</w:t>
       </w:r>
     </w:p>
-    <w:bookmarkStart w:id="270" w:name="einstieg-26"/>
+    <w:bookmarkStart w:id="264" w:name="einstieg-26"/>
     <w:p>
       <w:pPr>
         <w:pStyle w:val="Heading2"/>
@@ -24717,8 +24409,8 @@
         </w:pict>
       </w:r>
     </w:p>
-    <w:bookmarkEnd w:id="270"/>
-    <w:bookmarkStart w:id="271" w:name="aufgabe-1-lernen-durch-beispiele"/>
+    <w:bookmarkEnd w:id="264"/>
+    <w:bookmarkStart w:id="265" w:name="aufgabe-1-lernen-durch-beispiele"/>
     <w:p>
       <w:pPr>
         <w:pStyle w:val="Heading2"/>
@@ -24840,8 +24532,8 @@
         </w:pict>
       </w:r>
     </w:p>
-    <w:bookmarkEnd w:id="271"/>
-    <w:bookmarkStart w:id="272" w:name="aufgabe-2-beispiele-erkennen"/>
+    <w:bookmarkEnd w:id="265"/>
+    <w:bookmarkStart w:id="266" w:name="aufgabe-2-beispiele-erkennen"/>
     <w:p>
       <w:pPr>
         <w:pStyle w:val="Heading2"/>
@@ -24921,8 +24613,8 @@
         </w:pict>
       </w:r>
     </w:p>
-    <w:bookmarkEnd w:id="272"/>
-    <w:bookmarkStart w:id="273" w:name="aufgabe-3-warum-sind-viele-daten-wichtig"/>
+    <w:bookmarkEnd w:id="266"/>
+    <w:bookmarkStart w:id="267" w:name="aufgabe-3-warum-sind-viele-daten-wichtig"/>
     <w:p>
       <w:pPr>
         <w:pStyle w:val="Heading2"/>
@@ -24975,8 +24667,8 @@
         </w:pict>
       </w:r>
     </w:p>
-    <w:bookmarkEnd w:id="273"/>
-    <w:bookmarkStart w:id="274" w:name="aufgabe-4-ki-im-alltag"/>
+    <w:bookmarkEnd w:id="267"/>
+    <w:bookmarkStart w:id="268" w:name="aufgabe-4-ki-im-alltag"/>
     <w:p>
       <w:pPr>
         <w:pStyle w:val="Heading2"/>
@@ -25036,8 +24728,8 @@
         </w:pict>
       </w:r>
     </w:p>
-    <w:bookmarkEnd w:id="274"/>
-    <w:bookmarkStart w:id="275" w:name="aufgabe-5-nachdenken-1"/>
+    <w:bookmarkEnd w:id="268"/>
+    <w:bookmarkStart w:id="269" w:name="aufgabe-5-nachdenken-1"/>
     <w:p>
       <w:pPr>
         <w:pStyle w:val="Heading2"/>
@@ -25098,8 +24790,8 @@
         </w:pict>
       </w:r>
     </w:p>
-    <w:bookmarkEnd w:id="275"/>
-    <w:bookmarkStart w:id="276" w:name="merkkasten-22"/>
+    <w:bookmarkEnd w:id="269"/>
+    <w:bookmarkStart w:id="270" w:name="merkkasten-22"/>
     <w:p>
       <w:pPr>
         <w:pStyle w:val="Heading2"/>
@@ -25171,8 +24863,8 @@
         </w:pict>
       </w:r>
     </w:p>
-    <w:bookmarkEnd w:id="276"/>
-    <w:bookmarkStart w:id="277" w:name="das-nehmen-wir-mit-27"/>
+    <w:bookmarkEnd w:id="270"/>
+    <w:bookmarkStart w:id="271" w:name="das-nehmen-wir-mit-27"/>
     <w:p>
       <w:pPr>
         <w:pStyle w:val="Heading2"/>
@@ -25218,9 +24910,9 @@
         <w:br w:type="page"/>
       </w:r>
     </w:p>
-    <w:bookmarkEnd w:id="277"/>
-    <w:bookmarkEnd w:id="278"/>
-    <w:bookmarkStart w:id="279" w:name="chancen-und-grenzen-von-ki"/>
+    <w:bookmarkEnd w:id="271"/>
+    <w:bookmarkEnd w:id="272"/>
+    <w:bookmarkStart w:id="273" w:name="chancen-und-grenzen-von-ki"/>
     <w:p>
       <w:pPr>
         <w:pStyle w:val="Heading1"/>
@@ -25234,8 +24926,8 @@
         <w:br w:type="page"/>
       </w:r>
     </w:p>
-    <w:bookmarkEnd w:id="279"/>
-    <w:bookmarkStart w:id="292" w:name="X385612bda1a712001861a7a47b2d0eac46a61bc"/>
+    <w:bookmarkEnd w:id="273"/>
+    <w:bookmarkStart w:id="286" w:name="X385612bda1a712001861a7a47b2d0eac46a61bc"/>
     <w:p>
       <w:pPr>
         <w:pStyle w:val="Heading1"/>
@@ -25244,7 +24936,7 @@
         <w:t xml:space="preserve">Kapitel 6 – Verschiedene Arten von Künstlicher Intelligenz</w:t>
       </w:r>
     </w:p>
-    <w:bookmarkStart w:id="280" w:name="einstieg-27"/>
+    <w:bookmarkStart w:id="274" w:name="einstieg-27"/>
     <w:p>
       <w:pPr>
         <w:pStyle w:val="Heading2"/>
@@ -25300,8 +24992,8 @@
         </w:pict>
       </w:r>
     </w:p>
-    <w:bookmarkEnd w:id="280"/>
-    <w:bookmarkStart w:id="281" w:name="aufgabe-1-ki-im-alltag"/>
+    <w:bookmarkEnd w:id="274"/>
+    <w:bookmarkStart w:id="275" w:name="aufgabe-1-ki-im-alltag"/>
     <w:p>
       <w:pPr>
         <w:pStyle w:val="Heading2"/>
@@ -25777,8 +25469,8 @@
         </w:pict>
       </w:r>
     </w:p>
-    <w:bookmarkEnd w:id="281"/>
-    <w:bookmarkStart w:id="282" w:name="aufgabe-2-was-macht-diese-ki"/>
+    <w:bookmarkEnd w:id="275"/>
+    <w:bookmarkStart w:id="276" w:name="aufgabe-2-was-macht-diese-ki"/>
     <w:p>
       <w:pPr>
         <w:pStyle w:val="Heading2"/>
@@ -25947,8 +25639,8 @@
         </w:pict>
       </w:r>
     </w:p>
-    <w:bookmarkEnd w:id="282"/>
-    <w:bookmarkStart w:id="283" w:name="aufgabe-3-ki-zur-informationsgewinnung"/>
+    <w:bookmarkEnd w:id="276"/>
+    <w:bookmarkStart w:id="277" w:name="aufgabe-3-ki-zur-informationsgewinnung"/>
     <w:p>
       <w:pPr>
         <w:pStyle w:val="Heading2"/>
@@ -26024,8 +25716,8 @@
         </w:pict>
       </w:r>
     </w:p>
-    <w:bookmarkEnd w:id="283"/>
-    <w:bookmarkStart w:id="284" w:name="aufgabe-4-ki-vergleichen"/>
+    <w:bookmarkEnd w:id="277"/>
+    <w:bookmarkStart w:id="278" w:name="aufgabe-4-ki-vergleichen"/>
     <w:p>
       <w:pPr>
         <w:pStyle w:val="Heading2"/>
@@ -26194,8 +25886,8 @@
         </w:pict>
       </w:r>
     </w:p>
-    <w:bookmarkEnd w:id="284"/>
-    <w:bookmarkStart w:id="289" w:name="infokasten-wichtige-begriffe"/>
+    <w:bookmarkEnd w:id="278"/>
+    <w:bookmarkStart w:id="283" w:name="infokasten-wichtige-begriffe"/>
     <w:p>
       <w:pPr>
         <w:pStyle w:val="Heading2"/>
@@ -26204,7 +25896,7 @@
         <w:t xml:space="preserve">Infokasten – Wichtige Begriffe</w:t>
       </w:r>
     </w:p>
-    <w:bookmarkStart w:id="285" w:name="llm-large-language-model"/>
+    <w:bookmarkStart w:id="279" w:name="llm-large-language-model"/>
     <w:p>
       <w:pPr>
         <w:pStyle w:val="Heading3"/>
@@ -26333,8 +26025,8 @@
         </w:pict>
       </w:r>
     </w:p>
-    <w:bookmarkEnd w:id="285"/>
-    <w:bookmarkStart w:id="286" w:name="bild-ki"/>
+    <w:bookmarkEnd w:id="279"/>
+    <w:bookmarkStart w:id="280" w:name="bild-ki"/>
     <w:p>
       <w:pPr>
         <w:pStyle w:val="Heading3"/>
@@ -26414,8 +26106,8 @@
         </w:pict>
       </w:r>
     </w:p>
-    <w:bookmarkEnd w:id="286"/>
-    <w:bookmarkStart w:id="287" w:name="empfehlungs-ki"/>
+    <w:bookmarkEnd w:id="280"/>
+    <w:bookmarkStart w:id="281" w:name="empfehlungs-ki"/>
     <w:p>
       <w:pPr>
         <w:pStyle w:val="Heading3"/>
@@ -26503,8 +26195,8 @@
         </w:pict>
       </w:r>
     </w:p>
-    <w:bookmarkEnd w:id="287"/>
-    <w:bookmarkStart w:id="288" w:name="vorhersage-ki"/>
+    <w:bookmarkEnd w:id="281"/>
+    <w:bookmarkStart w:id="282" w:name="vorhersage-ki"/>
     <w:p>
       <w:pPr>
         <w:pStyle w:val="Heading3"/>
@@ -26592,9 +26284,9 @@
         </w:pict>
       </w:r>
     </w:p>
-    <w:bookmarkEnd w:id="288"/>
-    <w:bookmarkEnd w:id="289"/>
-    <w:bookmarkStart w:id="290" w:name="merkkasten-23"/>
+    <w:bookmarkEnd w:id="282"/>
+    <w:bookmarkEnd w:id="283"/>
+    <w:bookmarkStart w:id="284" w:name="merkkasten-23"/>
     <w:p>
       <w:pPr>
         <w:pStyle w:val="Heading2"/>
@@ -26647,8 +26339,8 @@
         </w:pict>
       </w:r>
     </w:p>
-    <w:bookmarkEnd w:id="290"/>
-    <w:bookmarkStart w:id="291" w:name="das-nehmen-wir-mit-28"/>
+    <w:bookmarkEnd w:id="284"/>
+    <w:bookmarkStart w:id="285" w:name="das-nehmen-wir-mit-28"/>
     <w:p>
       <w:pPr>
         <w:pStyle w:val="Heading2"/>
@@ -26694,9 +26386,9 @@
         <w:br w:type="page"/>
       </w:r>
     </w:p>
-    <w:bookmarkEnd w:id="291"/>
-    <w:bookmarkEnd w:id="292"/>
-    <w:bookmarkStart w:id="306" w:name="X4f87dc8ac4d004316af2d52634b2d3793521f77"/>
+    <w:bookmarkEnd w:id="285"/>
+    <w:bookmarkEnd w:id="286"/>
+    <w:bookmarkStart w:id="300" w:name="X4f87dc8ac4d004316af2d52634b2d3793521f77"/>
     <w:p>
       <w:pPr>
         <w:pStyle w:val="Heading1"/>
@@ -26705,7 +26397,7 @@
         <w:t xml:space="preserve">Kapitel 6 – KI als Werkzeug zur Informationsgewinnung</w:t>
       </w:r>
     </w:p>
-    <w:bookmarkStart w:id="293" w:name="einstieg-28"/>
+    <w:bookmarkStart w:id="287" w:name="einstieg-28"/>
     <w:p>
       <w:pPr>
         <w:pStyle w:val="Heading2"/>
@@ -26801,8 +26493,8 @@
         </w:pict>
       </w:r>
     </w:p>
-    <w:bookmarkEnd w:id="293"/>
-    <w:bookmarkStart w:id="294" w:name="aufgabe-1-welche-ki-hilft"/>
+    <w:bookmarkEnd w:id="287"/>
+    <w:bookmarkStart w:id="288" w:name="aufgabe-1-welche-ki-hilft"/>
     <w:p>
       <w:pPr>
         <w:pStyle w:val="Heading2"/>
@@ -27216,8 +26908,8 @@
         </w:pict>
       </w:r>
     </w:p>
-    <w:bookmarkEnd w:id="294"/>
-    <w:bookmarkStart w:id="295" w:name="aufgabe-2-was-ist-der-unterschied"/>
+    <w:bookmarkEnd w:id="288"/>
+    <w:bookmarkStart w:id="289" w:name="aufgabe-2-was-ist-der-unterschied"/>
     <w:p>
       <w:pPr>
         <w:pStyle w:val="Heading2"/>
@@ -27366,8 +27058,8 @@
         </w:pict>
       </w:r>
     </w:p>
-    <w:bookmarkEnd w:id="295"/>
-    <w:bookmarkStart w:id="296" w:name="X8d560b5ce6fe724c439f9cbb8489a28499283ca"/>
+    <w:bookmarkEnd w:id="289"/>
+    <w:bookmarkStart w:id="290" w:name="X8d560b5ce6fe724c439f9cbb8489a28499283ca"/>
     <w:p>
       <w:pPr>
         <w:pStyle w:val="Heading2"/>
@@ -27453,8 +27145,8 @@
         </w:pict>
       </w:r>
     </w:p>
-    <w:bookmarkEnd w:id="296"/>
-    <w:bookmarkStart w:id="297" w:name="X5ad03c3644c71ec82c892f1948d9c9475826668"/>
+    <w:bookmarkEnd w:id="290"/>
+    <w:bookmarkStart w:id="291" w:name="X5ad03c3644c71ec82c892f1948d9c9475826668"/>
     <w:p>
       <w:pPr>
         <w:pStyle w:val="Heading2"/>
@@ -27649,8 +27341,8 @@
         </w:pict>
       </w:r>
     </w:p>
-    <w:bookmarkEnd w:id="297"/>
-    <w:bookmarkStart w:id="302" w:name="infokasten-wichtige-begriffe-1"/>
+    <w:bookmarkEnd w:id="291"/>
+    <w:bookmarkStart w:id="296" w:name="infokasten-wichtige-begriffe-1"/>
     <w:p>
       <w:pPr>
         <w:pStyle w:val="Heading2"/>
@@ -27659,7 +27351,7 @@
         <w:t xml:space="preserve">Infokasten – Wichtige Begriffe</w:t>
       </w:r>
     </w:p>
-    <w:bookmarkStart w:id="298" w:name="suchmaschine"/>
+    <w:bookmarkStart w:id="292" w:name="suchmaschine"/>
     <w:p>
       <w:pPr>
         <w:pStyle w:val="Heading3"/>
@@ -27707,8 +27399,8 @@
         </w:pict>
       </w:r>
     </w:p>
-    <w:bookmarkEnd w:id="298"/>
-    <w:bookmarkStart w:id="299" w:name="sprach-ki-llm"/>
+    <w:bookmarkEnd w:id="292"/>
+    <w:bookmarkStart w:id="293" w:name="sprach-ki-llm"/>
     <w:p>
       <w:pPr>
         <w:pStyle w:val="Heading3"/>
@@ -27796,8 +27488,8 @@
         </w:pict>
       </w:r>
     </w:p>
-    <w:bookmarkEnd w:id="299"/>
-    <w:bookmarkStart w:id="300" w:name="bild-ki-1"/>
+    <w:bookmarkEnd w:id="293"/>
+    <w:bookmarkStart w:id="294" w:name="bild-ki-1"/>
     <w:p>
       <w:pPr>
         <w:pStyle w:val="Heading3"/>
@@ -27865,8 +27557,8 @@
         </w:pict>
       </w:r>
     </w:p>
-    <w:bookmarkEnd w:id="300"/>
-    <w:bookmarkStart w:id="301" w:name="vorhersage-ki-1"/>
+    <w:bookmarkEnd w:id="294"/>
+    <w:bookmarkStart w:id="295" w:name="vorhersage-ki-1"/>
     <w:p>
       <w:pPr>
         <w:pStyle w:val="Heading3"/>
@@ -27914,9 +27606,9 @@
         </w:pict>
       </w:r>
     </w:p>
-    <w:bookmarkEnd w:id="301"/>
-    <w:bookmarkEnd w:id="302"/>
-    <w:bookmarkStart w:id="303" w:name="aufgabe-5-ki-verantwortungsvoll-nutzen"/>
+    <w:bookmarkEnd w:id="295"/>
+    <w:bookmarkEnd w:id="296"/>
+    <w:bookmarkStart w:id="297" w:name="aufgabe-5-ki-verantwortungsvoll-nutzen"/>
     <w:p>
       <w:pPr>
         <w:pStyle w:val="Heading2"/>
@@ -28005,8 +27697,8 @@
         </w:pict>
       </w:r>
     </w:p>
-    <w:bookmarkEnd w:id="303"/>
-    <w:bookmarkStart w:id="304" w:name="merkkasten-24"/>
+    <w:bookmarkEnd w:id="297"/>
+    <w:bookmarkStart w:id="298" w:name="merkkasten-24"/>
     <w:p>
       <w:pPr>
         <w:pStyle w:val="Heading2"/>
@@ -28046,8 +27738,8 @@
         </w:pict>
       </w:r>
     </w:p>
-    <w:bookmarkEnd w:id="304"/>
-    <w:bookmarkStart w:id="305" w:name="das-nehmen-wir-mit-29"/>
+    <w:bookmarkEnd w:id="298"/>
+    <w:bookmarkStart w:id="299" w:name="das-nehmen-wir-mit-29"/>
     <w:p>
       <w:pPr>
         <w:pStyle w:val="Heading2"/>
@@ -28085,9 +27777,9 @@
         <w:br w:type="page"/>
       </w:r>
     </w:p>
-    <w:bookmarkEnd w:id="305"/>
-    <w:bookmarkEnd w:id="306"/>
-    <w:bookmarkStart w:id="315" w:name="X0c8126a804a59e92017588891cf76075bb8664b"/>
+    <w:bookmarkEnd w:id="299"/>
+    <w:bookmarkEnd w:id="300"/>
+    <w:bookmarkStart w:id="309" w:name="X0c8126a804a59e92017588891cf76075bb8664b"/>
     <w:p>
       <w:pPr>
         <w:pStyle w:val="Heading1"/>
@@ -28096,7 +27788,7 @@
         <w:t xml:space="preserve">Kapitel 6 – Datenschutz und Datensicherheit</w:t>
       </w:r>
     </w:p>
-    <w:bookmarkStart w:id="307" w:name="einstieg-29"/>
+    <w:bookmarkStart w:id="301" w:name="einstieg-29"/>
     <w:p>
       <w:pPr>
         <w:pStyle w:val="Heading2"/>
@@ -28204,8 +27896,8 @@
         </w:pict>
       </w:r>
     </w:p>
-    <w:bookmarkEnd w:id="307"/>
-    <w:bookmarkStart w:id="308" w:name="aufgabe-1-persönlich-oder-öffentlich"/>
+    <w:bookmarkEnd w:id="301"/>
+    <w:bookmarkStart w:id="302" w:name="aufgabe-1-persönlich-oder-öffentlich"/>
     <w:p>
       <w:pPr>
         <w:pStyle w:val="Heading2"/>
@@ -28549,8 +28241,8 @@
         </w:pict>
       </w:r>
     </w:p>
-    <w:bookmarkEnd w:id="308"/>
-    <w:bookmarkStart w:id="309" w:name="aufgabe-2-wer-darf-das-wissen"/>
+    <w:bookmarkEnd w:id="302"/>
+    <w:bookmarkStart w:id="303" w:name="aufgabe-2-wer-darf-das-wissen"/>
     <w:p>
       <w:pPr>
         <w:pStyle w:val="Heading2"/>
@@ -28871,8 +28563,8 @@
         </w:pict>
       </w:r>
     </w:p>
-    <w:bookmarkEnd w:id="309"/>
-    <w:bookmarkStart w:id="310" w:name="aufgabe-3-sicher-oder-unsicher"/>
+    <w:bookmarkEnd w:id="303"/>
+    <w:bookmarkStart w:id="304" w:name="aufgabe-3-sicher-oder-unsicher"/>
     <w:p>
       <w:pPr>
         <w:pStyle w:val="Heading2"/>
@@ -29140,8 +28832,8 @@
         </w:pict>
       </w:r>
     </w:p>
-    <w:bookmarkEnd w:id="310"/>
-    <w:bookmarkStart w:id="311" w:name="aufgabe-4-ki-und-persönliche-daten"/>
+    <w:bookmarkEnd w:id="304"/>
+    <w:bookmarkStart w:id="305" w:name="aufgabe-4-ki-und-persönliche-daten"/>
     <w:p>
       <w:pPr>
         <w:pStyle w:val="Heading2"/>
@@ -29302,8 +28994,8 @@
         </w:pict>
       </w:r>
     </w:p>
-    <w:bookmarkEnd w:id="311"/>
-    <w:bookmarkStart w:id="312" w:name="aufgabe-5-meine-regeln"/>
+    <w:bookmarkEnd w:id="305"/>
+    <w:bookmarkStart w:id="306" w:name="aufgabe-5-meine-regeln"/>
     <w:p>
       <w:pPr>
         <w:pStyle w:val="Heading2"/>
@@ -29348,8 +29040,8 @@
         </w:pict>
       </w:r>
     </w:p>
-    <w:bookmarkEnd w:id="312"/>
-    <w:bookmarkStart w:id="313" w:name="merkkasten-25"/>
+    <w:bookmarkEnd w:id="306"/>
+    <w:bookmarkStart w:id="307" w:name="merkkasten-25"/>
     <w:p>
       <w:pPr>
         <w:pStyle w:val="Heading2"/>
@@ -29409,8 +29101,8 @@
         </w:pict>
       </w:r>
     </w:p>
-    <w:bookmarkEnd w:id="313"/>
-    <w:bookmarkStart w:id="314" w:name="das-nehmen-wir-mit-30"/>
+    <w:bookmarkEnd w:id="307"/>
+    <w:bookmarkStart w:id="308" w:name="das-nehmen-wir-mit-30"/>
     <w:p>
       <w:pPr>
         <w:pStyle w:val="Heading2"/>
@@ -29497,9 +29189,9 @@
         <w:br w:type="page"/>
       </w:r>
     </w:p>
-    <w:bookmarkEnd w:id="314"/>
-    <w:bookmarkEnd w:id="315"/>
-    <w:bookmarkStart w:id="317" w:name="X6d810bb4b00e898309eacdbe4a2d6263edbea65"/>
+    <w:bookmarkEnd w:id="308"/>
+    <w:bookmarkEnd w:id="309"/>
+    <w:bookmarkStart w:id="311" w:name="X6d810bb4b00e898309eacdbe4a2d6263edbea65"/>
     <w:p>
       <w:pPr>
         <w:pStyle w:val="Heading1"/>
@@ -29508,7 +29200,7 @@
         <w:t xml:space="preserve">Abschlussprojekt – Das Schülerfestival planen</w:t>
       </w:r>
     </w:p>
-    <w:bookmarkStart w:id="316" w:name="ausgangssituation"/>
+    <w:bookmarkStart w:id="310" w:name="ausgangssituation"/>
     <w:p>
       <w:pPr>
         <w:pStyle w:val="Heading2"/>
@@ -29561,9 +29253,9 @@
         <w:br w:type="page"/>
       </w:r>
     </w:p>
-    <w:bookmarkEnd w:id="316"/>
-    <w:bookmarkEnd w:id="317"/>
-    <w:bookmarkStart w:id="318" w:name="aufgabe-1-informationen-sammeln"/>
+    <w:bookmarkEnd w:id="310"/>
+    <w:bookmarkEnd w:id="311"/>
+    <w:bookmarkStart w:id="312" w:name="aufgabe-1-informationen-sammeln"/>
     <w:p>
       <w:pPr>
         <w:pStyle w:val="Heading1"/>
@@ -29736,8 +29428,8 @@
         <w:br w:type="page"/>
       </w:r>
     </w:p>
-    <w:bookmarkEnd w:id="318"/>
-    <w:bookmarkStart w:id="319" w:name="aufgabe-2-informationen-ordnen"/>
+    <w:bookmarkEnd w:id="312"/>
+    <w:bookmarkStart w:id="313" w:name="aufgabe-2-informationen-ordnen"/>
     <w:p>
       <w:pPr>
         <w:pStyle w:val="Heading1"/>
@@ -29795,8 +29487,8 @@
         <w:br w:type="page"/>
       </w:r>
     </w:p>
-    <w:bookmarkEnd w:id="319"/>
-    <w:bookmarkStart w:id="320" w:name="aufgabe-3-eine-datenbank-planen"/>
+    <w:bookmarkEnd w:id="313"/>
+    <w:bookmarkStart w:id="314" w:name="aufgabe-3-eine-datenbank-planen"/>
     <w:p>
       <w:pPr>
         <w:pStyle w:val="Heading1"/>
@@ -29911,8 +29603,8 @@
         <w:br w:type="page"/>
       </w:r>
     </w:p>
-    <w:bookmarkEnd w:id="320"/>
-    <w:bookmarkStart w:id="321" w:name="aufgabe-4-schlüssel-festlegen"/>
+    <w:bookmarkEnd w:id="314"/>
+    <w:bookmarkStart w:id="315" w:name="aufgabe-4-schlüssel-festlegen"/>
     <w:p>
       <w:pPr>
         <w:pStyle w:val="Heading1"/>
@@ -30123,8 +29815,8 @@
         <w:br w:type="page"/>
       </w:r>
     </w:p>
-    <w:bookmarkEnd w:id="321"/>
-    <w:bookmarkStart w:id="322" w:name="aufgabe-5-informationen-finden"/>
+    <w:bookmarkEnd w:id="315"/>
+    <w:bookmarkStart w:id="316" w:name="aufgabe-5-informationen-finden"/>
     <w:p>
       <w:pPr>
         <w:pStyle w:val="Heading1"/>
@@ -30190,8 +29882,8 @@
         <w:br w:type="page"/>
       </w:r>
     </w:p>
-    <w:bookmarkEnd w:id="322"/>
-    <w:bookmarkStart w:id="323" w:name="aufgabe-6-informationen-filtern"/>
+    <w:bookmarkEnd w:id="316"/>
+    <w:bookmarkStart w:id="317" w:name="aufgabe-6-informationen-filtern"/>
     <w:p>
       <w:pPr>
         <w:pStyle w:val="Heading1"/>
@@ -30257,8 +29949,8 @@
         <w:br w:type="page"/>
       </w:r>
     </w:p>
-    <w:bookmarkEnd w:id="323"/>
-    <w:bookmarkStart w:id="324" w:name="aufgabe-7-informationen-sortieren"/>
+    <w:bookmarkEnd w:id="317"/>
+    <w:bookmarkStart w:id="318" w:name="aufgabe-7-informationen-sortieren"/>
     <w:p>
       <w:pPr>
         <w:pStyle w:val="Heading1"/>
@@ -30317,8 +30009,8 @@
         <w:br w:type="page"/>
       </w:r>
     </w:p>
-    <w:bookmarkEnd w:id="324"/>
-    <w:bookmarkStart w:id="325" w:name="aufgabe-8-informationen-auswerten"/>
+    <w:bookmarkEnd w:id="318"/>
+    <w:bookmarkStart w:id="319" w:name="aufgabe-8-informationen-auswerten"/>
     <w:p>
       <w:pPr>
         <w:pStyle w:val="Heading1"/>
@@ -30408,8 +30100,8 @@
         <w:br w:type="page"/>
       </w:r>
     </w:p>
-    <w:bookmarkEnd w:id="325"/>
-    <w:bookmarkStart w:id="326" w:name="aufgabe-9-ki-sinnvoll-einsetzen"/>
+    <w:bookmarkEnd w:id="319"/>
+    <w:bookmarkStart w:id="320" w:name="aufgabe-9-ki-sinnvoll-einsetzen"/>
     <w:p>
       <w:pPr>
         <w:pStyle w:val="Heading1"/>
@@ -30532,8 +30224,8 @@
         <w:br w:type="page"/>
       </w:r>
     </w:p>
-    <w:bookmarkEnd w:id="326"/>
-    <w:bookmarkStart w:id="327" w:name="aufgabe-10-datenschutz-beachten"/>
+    <w:bookmarkEnd w:id="320"/>
+    <w:bookmarkStart w:id="321" w:name="aufgabe-10-datenschutz-beachten"/>
     <w:p>
       <w:pPr>
         <w:pStyle w:val="Heading1"/>
@@ -30591,8 +30283,8 @@
         <w:br w:type="page"/>
       </w:r>
     </w:p>
-    <w:bookmarkEnd w:id="327"/>
-    <w:bookmarkStart w:id="328" w:name="reflexion-1"/>
+    <w:bookmarkEnd w:id="321"/>
+    <w:bookmarkStart w:id="322" w:name="reflexion"/>
     <w:p>
       <w:pPr>
         <w:pStyle w:val="Heading1"/>
@@ -30650,8 +30342,8 @@
         <w:br w:type="page"/>
       </w:r>
     </w:p>
-    <w:bookmarkEnd w:id="328"/>
-    <w:bookmarkStart w:id="329" w:name="das-nehmen-wir-mit-31"/>
+    <w:bookmarkEnd w:id="322"/>
+    <w:bookmarkStart w:id="323" w:name="das-nehmen-wir-mit-31"/>
     <w:p>
       <w:pPr>
         <w:pStyle w:val="Heading1"/>
@@ -30833,8 +30525,8 @@
         <w:br w:type="page"/>
       </w:r>
     </w:p>
-    <w:bookmarkEnd w:id="329"/>
-    <w:bookmarkStart w:id="340" w:name="sql-tabellen-anlegen"/>
+    <w:bookmarkEnd w:id="323"/>
+    <w:bookmarkStart w:id="334" w:name="sql-tabellen-anlegen"/>
     <w:p>
       <w:pPr>
         <w:pStyle w:val="Heading1"/>
@@ -30843,7 +30535,7 @@
         <w:t xml:space="preserve">SQL – Tabellen anlegen</w:t>
       </w:r>
     </w:p>
-    <w:bookmarkStart w:id="330" w:name="vom-datenmodell-zur-echten-tabelle"/>
+    <w:bookmarkStart w:id="324" w:name="vom-datenmodell-zur-echten-tabelle"/>
     <w:p>
       <w:pPr>
         <w:pStyle w:val="Heading2"/>
@@ -30913,8 +30605,8 @@
         </w:pict>
       </w:r>
     </w:p>
-    <w:bookmarkEnd w:id="330"/>
-    <w:bookmarkStart w:id="332" w:name="beispiel-klasse"/>
+    <w:bookmarkEnd w:id="324"/>
+    <w:bookmarkStart w:id="326" w:name="beispiel-klasse"/>
     <w:p>
       <w:pPr>
         <w:pStyle w:val="Heading2"/>
@@ -31069,7 +30761,7 @@
         <w:t xml:space="preserve">);</w:t>
       </w:r>
     </w:p>
-    <w:bookmarkStart w:id="331" w:name="bedeutung"/>
+    <w:bookmarkStart w:id="325" w:name="bedeutung"/>
     <w:p>
       <w:pPr>
         <w:pStyle w:val="Heading3"/>
@@ -31329,9 +31021,9 @@
         </w:pict>
       </w:r>
     </w:p>
-    <w:bookmarkEnd w:id="331"/>
-    <w:bookmarkEnd w:id="332"/>
-    <w:bookmarkStart w:id="333" w:name="zweite-tabelle"/>
+    <w:bookmarkEnd w:id="325"/>
+    <w:bookmarkEnd w:id="326"/>
+    <w:bookmarkStart w:id="327" w:name="zweite-tabelle"/>
     <w:p>
       <w:pPr>
         <w:pStyle w:val="Heading2"/>
@@ -31631,8 +31323,8 @@
         </w:pict>
       </w:r>
     </w:p>
-    <w:bookmarkEnd w:id="333"/>
-    <w:bookmarkStart w:id="334" w:name="aufgabe-1-1"/>
+    <w:bookmarkEnd w:id="327"/>
+    <w:bookmarkStart w:id="328" w:name="aufgabe-1-1"/>
     <w:p>
       <w:pPr>
         <w:pStyle w:val="Heading2"/>
@@ -31716,8 +31408,8 @@
         </w:pict>
       </w:r>
     </w:p>
-    <w:bookmarkEnd w:id="334"/>
-    <w:bookmarkStart w:id="335" w:name="aufgabe-2"/>
+    <w:bookmarkEnd w:id="328"/>
+    <w:bookmarkStart w:id="329" w:name="aufgabe-2"/>
     <w:p>
       <w:pPr>
         <w:pStyle w:val="Heading2"/>
@@ -31875,8 +31567,8 @@
         </w:pict>
       </w:r>
     </w:p>
-    <w:bookmarkEnd w:id="335"/>
-    <w:bookmarkStart w:id="338" w:name="aufgabe-3"/>
+    <w:bookmarkEnd w:id="329"/>
+    <w:bookmarkStart w:id="332" w:name="aufgabe-3"/>
     <w:p>
       <w:pPr>
         <w:pStyle w:val="Heading2"/>
@@ -31901,7 +31593,7 @@
         <w:t xml:space="preserve">Prüfe danach, ob sie existieren.</w:t>
       </w:r>
     </w:p>
-    <w:bookmarkStart w:id="336" w:name="cli"/>
+    <w:bookmarkStart w:id="330" w:name="cli"/>
     <w:p>
       <w:pPr>
         <w:pStyle w:val="Heading3"/>
@@ -31921,8 +31613,8 @@
         <w:t xml:space="preserve">.tables</w:t>
       </w:r>
     </w:p>
-    <w:bookmarkEnd w:id="336"/>
-    <w:bookmarkStart w:id="337" w:name="db-browser"/>
+    <w:bookmarkEnd w:id="330"/>
+    <w:bookmarkStart w:id="331" w:name="db-browser"/>
     <w:p>
       <w:pPr>
         <w:pStyle w:val="Heading3"/>
@@ -31962,9 +31654,9 @@
         </w:pict>
       </w:r>
     </w:p>
-    <w:bookmarkEnd w:id="337"/>
-    <w:bookmarkEnd w:id="338"/>
-    <w:bookmarkStart w:id="339" w:name="merke"/>
+    <w:bookmarkEnd w:id="331"/>
+    <w:bookmarkEnd w:id="332"/>
+    <w:bookmarkStart w:id="333" w:name="merke"/>
     <w:p>
       <w:pPr>
         <w:pStyle w:val="Heading2"/>
@@ -32001,9 +31693,9 @@
         <w:br w:type="page"/>
       </w:r>
     </w:p>
-    <w:bookmarkEnd w:id="339"/>
-    <w:bookmarkEnd w:id="340"/>
-    <w:bookmarkStart w:id="348" w:name="crud-daten-anlegen-und-lesen"/>
+    <w:bookmarkEnd w:id="333"/>
+    <w:bookmarkEnd w:id="334"/>
+    <w:bookmarkStart w:id="342" w:name="crud-daten-anlegen-und-lesen"/>
     <w:p>
       <w:pPr>
         <w:pStyle w:val="Heading1"/>
@@ -32221,7 +31913,7 @@
         </w:pict>
       </w:r>
     </w:p>
-    <w:bookmarkStart w:id="341" w:name="create-insert"/>
+    <w:bookmarkStart w:id="335" w:name="create-insert"/>
     <w:p>
       <w:pPr>
         <w:pStyle w:val="Heading2"/>
@@ -32474,8 +32166,8 @@
         </w:pict>
       </w:r>
     </w:p>
-    <w:bookmarkEnd w:id="341"/>
-    <w:bookmarkStart w:id="342" w:name="read-select"/>
+    <w:bookmarkEnd w:id="335"/>
+    <w:bookmarkStart w:id="336" w:name="read-select"/>
     <w:p>
       <w:pPr>
         <w:pStyle w:val="Heading2"/>
@@ -32662,8 +32354,8 @@
         </w:pict>
       </w:r>
     </w:p>
-    <w:bookmarkEnd w:id="342"/>
-    <w:bookmarkStart w:id="343" w:name="aufgabe-1-2"/>
+    <w:bookmarkEnd w:id="336"/>
+    <w:bookmarkStart w:id="337" w:name="aufgabe-1-2"/>
     <w:p>
       <w:pPr>
         <w:pStyle w:val="Heading2"/>
@@ -32737,8 +32429,8 @@
         </w:pict>
       </w:r>
     </w:p>
-    <w:bookmarkEnd w:id="343"/>
-    <w:bookmarkStart w:id="344" w:name="aufgabe-2-1"/>
+    <w:bookmarkEnd w:id="337"/>
+    <w:bookmarkStart w:id="338" w:name="aufgabe-2-1"/>
     <w:p>
       <w:pPr>
         <w:pStyle w:val="Heading2"/>
@@ -32843,8 +32535,8 @@
         </w:pict>
       </w:r>
     </w:p>
-    <w:bookmarkEnd w:id="344"/>
-    <w:bookmarkStart w:id="345" w:name="aufgabe-3-1"/>
+    <w:bookmarkEnd w:id="338"/>
+    <w:bookmarkStart w:id="339" w:name="aufgabe-3-1"/>
     <w:p>
       <w:pPr>
         <w:pStyle w:val="Heading2"/>
@@ -32888,8 +32580,8 @@
         </w:pict>
       </w:r>
     </w:p>
-    <w:bookmarkEnd w:id="345"/>
-    <w:bookmarkStart w:id="346" w:name="aufgabe-4"/>
+    <w:bookmarkEnd w:id="339"/>
+    <w:bookmarkStart w:id="340" w:name="aufgabe-4"/>
     <w:p>
       <w:pPr>
         <w:pStyle w:val="Heading2"/>
@@ -32954,8 +32646,8 @@
         </w:pict>
       </w:r>
     </w:p>
-    <w:bookmarkEnd w:id="346"/>
-    <w:bookmarkStart w:id="347" w:name="typischer-fehler"/>
+    <w:bookmarkEnd w:id="340"/>
+    <w:bookmarkStart w:id="341" w:name="typischer-fehler"/>
     <w:p>
       <w:pPr>
         <w:pStyle w:val="Heading2"/>
@@ -33057,9 +32749,9 @@
         <w:br w:type="page"/>
       </w:r>
     </w:p>
-    <w:bookmarkEnd w:id="347"/>
-    <w:bookmarkEnd w:id="348"/>
-    <w:bookmarkStart w:id="356" w:name="crud-daten-ändern-und-löschen"/>
+    <w:bookmarkEnd w:id="341"/>
+    <w:bookmarkEnd w:id="342"/>
+    <w:bookmarkStart w:id="350" w:name="crud-daten-ändern-und-löschen"/>
     <w:p>
       <w:pPr>
         <w:pStyle w:val="Heading1"/>
@@ -33107,7 +32799,7 @@
         </w:pict>
       </w:r>
     </w:p>
-    <w:bookmarkStart w:id="350" w:name="update"/>
+    <w:bookmarkStart w:id="344" w:name="update"/>
     <w:p>
       <w:pPr>
         <w:pStyle w:val="Heading2"/>
@@ -33205,7 +32897,7 @@
         <w:t xml:space="preserve">;</w:t>
       </w:r>
     </w:p>
-    <w:bookmarkStart w:id="349" w:name="wichtig"/>
+    <w:bookmarkStart w:id="343" w:name="wichtig"/>
     <w:p>
       <w:pPr>
         <w:pStyle w:val="Heading3"/>
@@ -33338,9 +33030,9 @@
         </w:pict>
       </w:r>
     </w:p>
-    <w:bookmarkEnd w:id="349"/>
-    <w:bookmarkEnd w:id="350"/>
-    <w:bookmarkStart w:id="351" w:name="delete"/>
+    <w:bookmarkEnd w:id="343"/>
+    <w:bookmarkEnd w:id="344"/>
+    <w:bookmarkStart w:id="345" w:name="delete"/>
     <w:p>
       <w:pPr>
         <w:pStyle w:val="Heading2"/>
@@ -33494,8 +33186,8 @@
         </w:pict>
       </w:r>
     </w:p>
-    <w:bookmarkEnd w:id="351"/>
-    <w:bookmarkStart w:id="352" w:name="aufgabe-1-3"/>
+    <w:bookmarkEnd w:id="345"/>
+    <w:bookmarkStart w:id="346" w:name="aufgabe-1-3"/>
     <w:p>
       <w:pPr>
         <w:pStyle w:val="Heading2"/>
@@ -33575,8 +33267,8 @@
         </w:pict>
       </w:r>
     </w:p>
-    <w:bookmarkEnd w:id="352"/>
-    <w:bookmarkStart w:id="353" w:name="aufgabe-2-2"/>
+    <w:bookmarkEnd w:id="346"/>
+    <w:bookmarkStart w:id="347" w:name="aufgabe-2-2"/>
     <w:p>
       <w:pPr>
         <w:pStyle w:val="Heading2"/>
@@ -33656,8 +33348,8 @@
         </w:pict>
       </w:r>
     </w:p>
-    <w:bookmarkEnd w:id="353"/>
-    <w:bookmarkStart w:id="354" w:name="aufgabe-3-2"/>
+    <w:bookmarkEnd w:id="347"/>
+    <w:bookmarkStart w:id="348" w:name="aufgabe-3-2"/>
     <w:p>
       <w:pPr>
         <w:pStyle w:val="Heading2"/>
@@ -33713,8 +33405,8 @@
         </w:pict>
       </w:r>
     </w:p>
-    <w:bookmarkEnd w:id="354"/>
-    <w:bookmarkStart w:id="355" w:name="sicherheitscheck"/>
+    <w:bookmarkEnd w:id="348"/>
+    <w:bookmarkStart w:id="349" w:name="sicherheitscheck"/>
     <w:p>
       <w:pPr>
         <w:pStyle w:val="Heading2"/>
@@ -34053,9 +33745,9 @@
         <w:br w:type="page"/>
       </w:r>
     </w:p>
-    <w:bookmarkEnd w:id="355"/>
-    <w:bookmarkEnd w:id="356"/>
-    <w:bookmarkStart w:id="364" w:name="sql-constraints-und-schlüssel"/>
+    <w:bookmarkEnd w:id="349"/>
+    <w:bookmarkEnd w:id="350"/>
+    <w:bookmarkStart w:id="358" w:name="sql-constraints-und-schlüssel"/>
     <w:p>
       <w:pPr>
         <w:pStyle w:val="Heading1"/>
@@ -34108,7 +33800,7 @@
         </w:pict>
       </w:r>
     </w:p>
-    <w:bookmarkStart w:id="357" w:name="primary-key"/>
+    <w:bookmarkStart w:id="351" w:name="primary-key"/>
     <w:p>
       <w:pPr>
         <w:pStyle w:val="Heading2"/>
@@ -34173,8 +33865,8 @@
         </w:pict>
       </w:r>
     </w:p>
-    <w:bookmarkEnd w:id="357"/>
-    <w:bookmarkStart w:id="358" w:name="unique"/>
+    <w:bookmarkEnd w:id="351"/>
+    <w:bookmarkStart w:id="352" w:name="unique"/>
     <w:p>
       <w:pPr>
         <w:pStyle w:val="Heading2"/>
@@ -34259,8 +33951,8 @@
         </w:pict>
       </w:r>
     </w:p>
-    <w:bookmarkEnd w:id="358"/>
-    <w:bookmarkStart w:id="359" w:name="not-null"/>
+    <w:bookmarkEnd w:id="352"/>
+    <w:bookmarkStart w:id="353" w:name="not-null"/>
     <w:p>
       <w:pPr>
         <w:pStyle w:val="Heading2"/>
@@ -34337,8 +34029,8 @@
         </w:pict>
       </w:r>
     </w:p>
-    <w:bookmarkEnd w:id="359"/>
-    <w:bookmarkStart w:id="360" w:name="foreign-key"/>
+    <w:bookmarkEnd w:id="353"/>
+    <w:bookmarkStart w:id="354" w:name="foreign-key"/>
     <w:p>
       <w:pPr>
         <w:pStyle w:val="Heading2"/>
@@ -34412,8 +34104,8 @@
         </w:pict>
       </w:r>
     </w:p>
-    <w:bookmarkEnd w:id="360"/>
-    <w:bookmarkStart w:id="361" w:name="zusammengesetzter-schlüssel"/>
+    <w:bookmarkEnd w:id="354"/>
+    <w:bookmarkStart w:id="355" w:name="zusammengesetzter-schlüssel"/>
     <w:p>
       <w:pPr>
         <w:pStyle w:val="Heading2"/>
@@ -34558,8 +34250,8 @@
         </w:pict>
       </w:r>
     </w:p>
-    <w:bookmarkEnd w:id="361"/>
-    <w:bookmarkStart w:id="362" w:name="alternative-schlüssel"/>
+    <w:bookmarkEnd w:id="355"/>
+    <w:bookmarkStart w:id="356" w:name="alternative-schlüssel"/>
     <w:p>
       <w:pPr>
         <w:pStyle w:val="Heading2"/>
@@ -34686,8 +34378,8 @@
         </w:pict>
       </w:r>
     </w:p>
-    <w:bookmarkEnd w:id="362"/>
-    <w:bookmarkStart w:id="363" w:name="aufgabe"/>
+    <w:bookmarkEnd w:id="356"/>
+    <w:bookmarkStart w:id="357" w:name="aufgabe"/>
     <w:p>
       <w:pPr>
         <w:pStyle w:val="Heading2"/>
@@ -34838,9 +34530,9 @@
         <w:br w:type="page"/>
       </w:r>
     </w:p>
-    <w:bookmarkEnd w:id="363"/>
-    <w:bookmarkEnd w:id="364"/>
-    <w:bookmarkStart w:id="377" w:name="sql-praxisauftrag"/>
+    <w:bookmarkEnd w:id="357"/>
+    <w:bookmarkEnd w:id="358"/>
+    <w:bookmarkStart w:id="371" w:name="sql-praxisauftrag"/>
     <w:p>
       <w:pPr>
         <w:pStyle w:val="Heading1"/>
@@ -34849,7 +34541,7 @@
         <w:t xml:space="preserve">SQL – Praxisauftrag</w:t>
       </w:r>
     </w:p>
-    <w:bookmarkStart w:id="368" w:name="auftrag-1"/>
+    <w:bookmarkStart w:id="362" w:name="auftrag-1"/>
     <w:p>
       <w:pPr>
         <w:pStyle w:val="Heading2"/>
@@ -34866,7 +34558,7 @@
         <w:t xml:space="preserve">Erstellt eine kleine Datenbank für Schulkurse.</w:t>
       </w:r>
     </w:p>
-    <w:bookmarkStart w:id="365" w:name="tabelle-schueler"/>
+    <w:bookmarkStart w:id="359" w:name="tabelle-schueler"/>
     <w:p>
       <w:pPr>
         <w:pStyle w:val="Heading3"/>
@@ -34920,8 +34612,8 @@
         <w:t xml:space="preserve">Name</w:t>
       </w:r>
     </w:p>
-    <w:bookmarkEnd w:id="365"/>
-    <w:bookmarkStart w:id="366" w:name="tabelle-kurs"/>
+    <w:bookmarkEnd w:id="359"/>
+    <w:bookmarkStart w:id="360" w:name="tabelle-kurs"/>
     <w:p>
       <w:pPr>
         <w:pStyle w:val="Heading3"/>
@@ -34963,8 +34655,8 @@
         <w:t xml:space="preserve">Bezeichnung</w:t>
       </w:r>
     </w:p>
-    <w:bookmarkEnd w:id="366"/>
-    <w:bookmarkStart w:id="367" w:name="tabelle-teilnahme"/>
+    <w:bookmarkEnd w:id="360"/>
+    <w:bookmarkStart w:id="361" w:name="tabelle-teilnahme"/>
     <w:p>
       <w:pPr>
         <w:pStyle w:val="Heading3"/>
@@ -35013,9 +34705,9 @@
         </w:pict>
       </w:r>
     </w:p>
-    <w:bookmarkEnd w:id="367"/>
-    <w:bookmarkEnd w:id="368"/>
-    <w:bookmarkStart w:id="369" w:name="anforderungen"/>
+    <w:bookmarkEnd w:id="361"/>
+    <w:bookmarkEnd w:id="362"/>
+    <w:bookmarkStart w:id="363" w:name="anforderungen"/>
     <w:p>
       <w:pPr>
         <w:pStyle w:val="Heading2"/>
@@ -35124,8 +34816,8 @@
         </w:pict>
       </w:r>
     </w:p>
-    <w:bookmarkEnd w:id="369"/>
-    <w:bookmarkStart w:id="370" w:name="teil-a-tabellen"/>
+    <w:bookmarkEnd w:id="363"/>
+    <w:bookmarkStart w:id="364" w:name="teil-a-tabellen"/>
     <w:p>
       <w:pPr>
         <w:pStyle w:val="Heading2"/>
@@ -35161,8 +34853,8 @@
         </w:pict>
       </w:r>
     </w:p>
-    <w:bookmarkEnd w:id="370"/>
-    <w:bookmarkStart w:id="371" w:name="teil-b-create"/>
+    <w:bookmarkEnd w:id="364"/>
+    <w:bookmarkStart w:id="365" w:name="teil-b-create"/>
     <w:p>
       <w:pPr>
         <w:pStyle w:val="Heading2"/>
@@ -35201,8 +34893,8 @@
         </w:pict>
       </w:r>
     </w:p>
-    <w:bookmarkEnd w:id="371"/>
-    <w:bookmarkStart w:id="372" w:name="teil-c-read"/>
+    <w:bookmarkEnd w:id="365"/>
+    <w:bookmarkStart w:id="366" w:name="teil-c-read"/>
     <w:p>
       <w:pPr>
         <w:pStyle w:val="Heading2"/>
@@ -35234,8 +34926,8 @@
         </w:pict>
       </w:r>
     </w:p>
-    <w:bookmarkEnd w:id="372"/>
-    <w:bookmarkStart w:id="373" w:name="teil-d-update"/>
+    <w:bookmarkEnd w:id="366"/>
+    <w:bookmarkStart w:id="367" w:name="teil-d-update"/>
     <w:p>
       <w:pPr>
         <w:pStyle w:val="Heading2"/>
@@ -35259,8 +34951,8 @@
         </w:pict>
       </w:r>
     </w:p>
-    <w:bookmarkEnd w:id="373"/>
-    <w:bookmarkStart w:id="374" w:name="teil-e-delete"/>
+    <w:bookmarkEnd w:id="367"/>
+    <w:bookmarkStart w:id="368" w:name="teil-e-delete"/>
     <w:p>
       <w:pPr>
         <w:pStyle w:val="Heading2"/>
@@ -35358,8 +35050,8 @@
         </w:pict>
       </w:r>
     </w:p>
-    <w:bookmarkEnd w:id="374"/>
-    <w:bookmarkStart w:id="375" w:name="teil-f-beziehung"/>
+    <w:bookmarkEnd w:id="368"/>
+    <w:bookmarkStart w:id="369" w:name="teil-f-beziehung"/>
     <w:p>
       <w:pPr>
         <w:pStyle w:val="Heading2"/>
@@ -35420,8 +35112,8 @@
         </w:pict>
       </w:r>
     </w:p>
-    <w:bookmarkEnd w:id="375"/>
-    <w:bookmarkStart w:id="376" w:name="reflexion-2"/>
+    <w:bookmarkEnd w:id="369"/>
+    <w:bookmarkStart w:id="370" w:name="reflexion-1"/>
     <w:p>
       <w:pPr>
         <w:pStyle w:val="Heading2"/>
@@ -35460,8 +35152,8 @@
         </w:pict>
       </w:r>
     </w:p>
-    <w:bookmarkEnd w:id="376"/>
-    <w:bookmarkEnd w:id="377"/>
+    <w:bookmarkEnd w:id="370"/>
+    <w:bookmarkEnd w:id="371"/>
     <w:sectPr>
       <w:headerReference r:id="rId9" w:type="default"/>
       <w:footerReference r:id="rId11" w:type="default"/>
@@ -35492,7 +35184,7 @@
       <w:rPr>
         <w:sz w:val="16"/>
       </w:rPr>
-      <w:t>Unterrichtsmaterial Oberschule Sachsen · Version v0.4.0-459-gb11fd20-dirty · Build 18.08.2026</w:t>
+      <w:t>Unterrichtsmaterial Oberschule Sachsen · Version v0.4.0-444-gad95bb4-dirty · Build 18.08.2026</w:t>
     </w:r>
   </w:p>
 </w:ftr>

</xml_diff>